<commit_message>
update PRD_VinhKhanh_Final.docx update PRD_UML_VinhKhanh.html sửa lỗi và cập nhật tài liệu
</commit_message>
<xml_diff>
--- a/PRD_VinhKhanh_Final.docx
+++ b/PRD_VinhKhanh_Final.docx
@@ -63,12 +63,6 @@
         <w:gridCol w:w="6026"/>
       </w:tblGrid>
       <w:tr>
-        <w:tblPrEx>
-          <w:tblCellMar>
-            <w:top w:w="0" w:type="dxa"/>
-            <w:bottom w:w="0" w:type="dxa"/>
-          </w:tblCellMar>
-        </w:tblPrEx>
         <w:tc>
           <w:tcPr>
             <w:tcW w:w="3000" w:type="dxa"/>
@@ -122,12 +116,6 @@
         </w:tc>
       </w:tr>
       <w:tr>
-        <w:tblPrEx>
-          <w:tblCellMar>
-            <w:top w:w="0" w:type="dxa"/>
-            <w:bottom w:w="0" w:type="dxa"/>
-          </w:tblCellMar>
-        </w:tblPrEx>
         <w:tc>
           <w:tcPr>
             <w:tcW w:w="3000" w:type="dxa"/>
@@ -181,12 +169,6 @@
         </w:tc>
       </w:tr>
       <w:tr>
-        <w:tblPrEx>
-          <w:tblCellMar>
-            <w:top w:w="0" w:type="dxa"/>
-            <w:bottom w:w="0" w:type="dxa"/>
-          </w:tblCellMar>
-        </w:tblPrEx>
         <w:tc>
           <w:tcPr>
             <w:tcW w:w="3000" w:type="dxa"/>
@@ -240,12 +222,6 @@
         </w:tc>
       </w:tr>
       <w:tr>
-        <w:tblPrEx>
-          <w:tblCellMar>
-            <w:top w:w="0" w:type="dxa"/>
-            <w:bottom w:w="0" w:type="dxa"/>
-          </w:tblCellMar>
-        </w:tblPrEx>
         <w:tc>
           <w:tcPr>
             <w:tcW w:w="3000" w:type="dxa"/>
@@ -299,12 +275,6 @@
         </w:tc>
       </w:tr>
       <w:tr>
-        <w:tblPrEx>
-          <w:tblCellMar>
-            <w:top w:w="0" w:type="dxa"/>
-            <w:bottom w:w="0" w:type="dxa"/>
-          </w:tblCellMar>
-        </w:tblPrEx>
         <w:tc>
           <w:tcPr>
             <w:tcW w:w="3000" w:type="dxa"/>
@@ -358,12 +328,6 @@
         </w:tc>
       </w:tr>
       <w:tr>
-        <w:tblPrEx>
-          <w:tblCellMar>
-            <w:top w:w="0" w:type="dxa"/>
-            <w:bottom w:w="0" w:type="dxa"/>
-          </w:tblCellMar>
-        </w:tblPrEx>
         <w:tc>
           <w:tcPr>
             <w:tcW w:w="3000" w:type="dxa"/>
@@ -553,12 +517,6 @@
         <w:gridCol w:w="2026"/>
       </w:tblGrid>
       <w:tr>
-        <w:tblPrEx>
-          <w:tblCellMar>
-            <w:top w:w="0" w:type="dxa"/>
-            <w:bottom w:w="0" w:type="dxa"/>
-          </w:tblCellMar>
-        </w:tblPrEx>
         <w:trPr>
           <w:tblHeader/>
         </w:trPr>
@@ -676,12 +634,6 @@
         </w:tc>
       </w:tr>
       <w:tr>
-        <w:tblPrEx>
-          <w:tblCellMar>
-            <w:top w:w="0" w:type="dxa"/>
-            <w:bottom w:w="0" w:type="dxa"/>
-          </w:tblCellMar>
-        </w:tblPrEx>
         <w:tc>
           <w:tcPr>
             <w:tcW w:w="2000" w:type="dxa"/>
@@ -776,12 +728,6 @@
         </w:tc>
       </w:tr>
       <w:tr>
-        <w:tblPrEx>
-          <w:tblCellMar>
-            <w:top w:w="0" w:type="dxa"/>
-            <w:bottom w:w="0" w:type="dxa"/>
-          </w:tblCellMar>
-        </w:tblPrEx>
         <w:tc>
           <w:tcPr>
             <w:tcW w:w="2000" w:type="dxa"/>
@@ -876,12 +822,6 @@
         </w:tc>
       </w:tr>
       <w:tr>
-        <w:tblPrEx>
-          <w:tblCellMar>
-            <w:top w:w="0" w:type="dxa"/>
-            <w:bottom w:w="0" w:type="dxa"/>
-          </w:tblCellMar>
-        </w:tblPrEx>
         <w:tc>
           <w:tcPr>
             <w:tcW w:w="2000" w:type="dxa"/>
@@ -1186,12 +1126,6 @@
         <w:gridCol w:w="2263"/>
       </w:tblGrid>
       <w:tr>
-        <w:tblPrEx>
-          <w:tblCellMar>
-            <w:top w:w="0" w:type="dxa"/>
-            <w:bottom w:w="0" w:type="dxa"/>
-          </w:tblCellMar>
-        </w:tblPrEx>
         <w:trPr>
           <w:tblHeader/>
         </w:trPr>
@@ -1309,12 +1243,6 @@
         </w:tc>
       </w:tr>
       <w:tr>
-        <w:tblPrEx>
-          <w:tblCellMar>
-            <w:top w:w="0" w:type="dxa"/>
-            <w:bottom w:w="0" w:type="dxa"/>
-          </w:tblCellMar>
-        </w:tblPrEx>
         <w:tc>
           <w:tcPr>
             <w:tcW w:w="2500" w:type="dxa"/>
@@ -1409,12 +1337,6 @@
         </w:tc>
       </w:tr>
       <w:tr>
-        <w:tblPrEx>
-          <w:tblCellMar>
-            <w:top w:w="0" w:type="dxa"/>
-            <w:bottom w:w="0" w:type="dxa"/>
-          </w:tblCellMar>
-        </w:tblPrEx>
         <w:tc>
           <w:tcPr>
             <w:tcW w:w="2500" w:type="dxa"/>
@@ -1509,12 +1431,6 @@
         </w:tc>
       </w:tr>
       <w:tr>
-        <w:tblPrEx>
-          <w:tblCellMar>
-            <w:top w:w="0" w:type="dxa"/>
-            <w:bottom w:w="0" w:type="dxa"/>
-          </w:tblCellMar>
-        </w:tblPrEx>
         <w:tc>
           <w:tcPr>
             <w:tcW w:w="2500" w:type="dxa"/>
@@ -1609,12 +1525,6 @@
         </w:tc>
       </w:tr>
       <w:tr>
-        <w:tblPrEx>
-          <w:tblCellMar>
-            <w:top w:w="0" w:type="dxa"/>
-            <w:bottom w:w="0" w:type="dxa"/>
-          </w:tblCellMar>
-        </w:tblPrEx>
         <w:tc>
           <w:tcPr>
             <w:tcW w:w="2500" w:type="dxa"/>
@@ -1709,12 +1619,6 @@
         </w:tc>
       </w:tr>
       <w:tr>
-        <w:tblPrEx>
-          <w:tblCellMar>
-            <w:top w:w="0" w:type="dxa"/>
-            <w:bottom w:w="0" w:type="dxa"/>
-          </w:tblCellMar>
-        </w:tblPrEx>
         <w:tc>
           <w:tcPr>
             <w:tcW w:w="2500" w:type="dxa"/>
@@ -1862,12 +1766,6 @@
         <w:gridCol w:w="6526"/>
       </w:tblGrid>
       <w:tr>
-        <w:tblPrEx>
-          <w:tblCellMar>
-            <w:top w:w="0" w:type="dxa"/>
-            <w:bottom w:w="0" w:type="dxa"/>
-          </w:tblCellMar>
-        </w:tblPrEx>
         <w:trPr>
           <w:tblHeader/>
         </w:trPr>
@@ -1929,12 +1827,6 @@
         </w:tc>
       </w:tr>
       <w:tr>
-        <w:tblPrEx>
-          <w:tblCellMar>
-            <w:top w:w="0" w:type="dxa"/>
-            <w:bottom w:w="0" w:type="dxa"/>
-          </w:tblCellMar>
-        </w:tblPrEx>
         <w:tc>
           <w:tcPr>
             <w:tcW w:w="2500" w:type="dxa"/>
@@ -1983,12 +1875,6 @@
         </w:tc>
       </w:tr>
       <w:tr>
-        <w:tblPrEx>
-          <w:tblCellMar>
-            <w:top w:w="0" w:type="dxa"/>
-            <w:bottom w:w="0" w:type="dxa"/>
-          </w:tblCellMar>
-        </w:tblPrEx>
         <w:tc>
           <w:tcPr>
             <w:tcW w:w="2500" w:type="dxa"/>
@@ -2037,12 +1923,6 @@
         </w:tc>
       </w:tr>
       <w:tr>
-        <w:tblPrEx>
-          <w:tblCellMar>
-            <w:top w:w="0" w:type="dxa"/>
-            <w:bottom w:w="0" w:type="dxa"/>
-          </w:tblCellMar>
-        </w:tblPrEx>
         <w:tc>
           <w:tcPr>
             <w:tcW w:w="2500" w:type="dxa"/>
@@ -2091,12 +1971,6 @@
         </w:tc>
       </w:tr>
       <w:tr>
-        <w:tblPrEx>
-          <w:tblCellMar>
-            <w:top w:w="0" w:type="dxa"/>
-            <w:bottom w:w="0" w:type="dxa"/>
-          </w:tblCellMar>
-        </w:tblPrEx>
         <w:tc>
           <w:tcPr>
             <w:tcW w:w="2500" w:type="dxa"/>
@@ -2145,12 +2019,6 @@
         </w:tc>
       </w:tr>
       <w:tr>
-        <w:tblPrEx>
-          <w:tblCellMar>
-            <w:top w:w="0" w:type="dxa"/>
-            <w:bottom w:w="0" w:type="dxa"/>
-          </w:tblCellMar>
-        </w:tblPrEx>
         <w:tc>
           <w:tcPr>
             <w:tcW w:w="2500" w:type="dxa"/>
@@ -2199,12 +2067,6 @@
         </w:tc>
       </w:tr>
       <w:tr>
-        <w:tblPrEx>
-          <w:tblCellMar>
-            <w:top w:w="0" w:type="dxa"/>
-            <w:bottom w:w="0" w:type="dxa"/>
-          </w:tblCellMar>
-        </w:tblPrEx>
         <w:tc>
           <w:tcPr>
             <w:tcW w:w="2500" w:type="dxa"/>
@@ -2284,12 +2146,6 @@
         <w:gridCol w:w="6526"/>
       </w:tblGrid>
       <w:tr>
-        <w:tblPrEx>
-          <w:tblCellMar>
-            <w:top w:w="0" w:type="dxa"/>
-            <w:bottom w:w="0" w:type="dxa"/>
-          </w:tblCellMar>
-        </w:tblPrEx>
         <w:trPr>
           <w:tblHeader/>
         </w:trPr>
@@ -2351,12 +2207,6 @@
         </w:tc>
       </w:tr>
       <w:tr>
-        <w:tblPrEx>
-          <w:tblCellMar>
-            <w:top w:w="0" w:type="dxa"/>
-            <w:bottom w:w="0" w:type="dxa"/>
-          </w:tblCellMar>
-        </w:tblPrEx>
         <w:tc>
           <w:tcPr>
             <w:tcW w:w="2500" w:type="dxa"/>
@@ -2405,12 +2255,6 @@
         </w:tc>
       </w:tr>
       <w:tr>
-        <w:tblPrEx>
-          <w:tblCellMar>
-            <w:top w:w="0" w:type="dxa"/>
-            <w:bottom w:w="0" w:type="dxa"/>
-          </w:tblCellMar>
-        </w:tblPrEx>
         <w:tc>
           <w:tcPr>
             <w:tcW w:w="2500" w:type="dxa"/>
@@ -2459,12 +2303,6 @@
         </w:tc>
       </w:tr>
       <w:tr>
-        <w:tblPrEx>
-          <w:tblCellMar>
-            <w:top w:w="0" w:type="dxa"/>
-            <w:bottom w:w="0" w:type="dxa"/>
-          </w:tblCellMar>
-        </w:tblPrEx>
         <w:tc>
           <w:tcPr>
             <w:tcW w:w="2500" w:type="dxa"/>
@@ -2513,12 +2351,6 @@
         </w:tc>
       </w:tr>
       <w:tr>
-        <w:tblPrEx>
-          <w:tblCellMar>
-            <w:top w:w="0" w:type="dxa"/>
-            <w:bottom w:w="0" w:type="dxa"/>
-          </w:tblCellMar>
-        </w:tblPrEx>
         <w:tc>
           <w:tcPr>
             <w:tcW w:w="2500" w:type="dxa"/>
@@ -2567,12 +2399,6 @@
         </w:tc>
       </w:tr>
       <w:tr>
-        <w:tblPrEx>
-          <w:tblCellMar>
-            <w:top w:w="0" w:type="dxa"/>
-            <w:bottom w:w="0" w:type="dxa"/>
-          </w:tblCellMar>
-        </w:tblPrEx>
         <w:tc>
           <w:tcPr>
             <w:tcW w:w="2500" w:type="dxa"/>
@@ -2621,12 +2447,6 @@
         </w:tc>
       </w:tr>
       <w:tr>
-        <w:tblPrEx>
-          <w:tblCellMar>
-            <w:top w:w="0" w:type="dxa"/>
-            <w:bottom w:w="0" w:type="dxa"/>
-          </w:tblCellMar>
-        </w:tblPrEx>
         <w:tc>
           <w:tcPr>
             <w:tcW w:w="2500" w:type="dxa"/>
@@ -2706,12 +2526,6 @@
         <w:gridCol w:w="6526"/>
       </w:tblGrid>
       <w:tr>
-        <w:tblPrEx>
-          <w:tblCellMar>
-            <w:top w:w="0" w:type="dxa"/>
-            <w:bottom w:w="0" w:type="dxa"/>
-          </w:tblCellMar>
-        </w:tblPrEx>
         <w:trPr>
           <w:tblHeader/>
         </w:trPr>
@@ -2773,12 +2587,6 @@
         </w:tc>
       </w:tr>
       <w:tr>
-        <w:tblPrEx>
-          <w:tblCellMar>
-            <w:top w:w="0" w:type="dxa"/>
-            <w:bottom w:w="0" w:type="dxa"/>
-          </w:tblCellMar>
-        </w:tblPrEx>
         <w:tc>
           <w:tcPr>
             <w:tcW w:w="2500" w:type="dxa"/>
@@ -2827,12 +2635,6 @@
         </w:tc>
       </w:tr>
       <w:tr>
-        <w:tblPrEx>
-          <w:tblCellMar>
-            <w:top w:w="0" w:type="dxa"/>
-            <w:bottom w:w="0" w:type="dxa"/>
-          </w:tblCellMar>
-        </w:tblPrEx>
         <w:tc>
           <w:tcPr>
             <w:tcW w:w="2500" w:type="dxa"/>
@@ -2881,12 +2683,6 @@
         </w:tc>
       </w:tr>
       <w:tr>
-        <w:tblPrEx>
-          <w:tblCellMar>
-            <w:top w:w="0" w:type="dxa"/>
-            <w:bottom w:w="0" w:type="dxa"/>
-          </w:tblCellMar>
-        </w:tblPrEx>
         <w:tc>
           <w:tcPr>
             <w:tcW w:w="2500" w:type="dxa"/>
@@ -2935,12 +2731,6 @@
         </w:tc>
       </w:tr>
       <w:tr>
-        <w:tblPrEx>
-          <w:tblCellMar>
-            <w:top w:w="0" w:type="dxa"/>
-            <w:bottom w:w="0" w:type="dxa"/>
-          </w:tblCellMar>
-        </w:tblPrEx>
         <w:tc>
           <w:tcPr>
             <w:tcW w:w="2500" w:type="dxa"/>
@@ -2989,12 +2779,6 @@
         </w:tc>
       </w:tr>
       <w:tr>
-        <w:tblPrEx>
-          <w:tblCellMar>
-            <w:top w:w="0" w:type="dxa"/>
-            <w:bottom w:w="0" w:type="dxa"/>
-          </w:tblCellMar>
-        </w:tblPrEx>
         <w:tc>
           <w:tcPr>
             <w:tcW w:w="2500" w:type="dxa"/>
@@ -3043,12 +2827,6 @@
         </w:tc>
       </w:tr>
       <w:tr>
-        <w:tblPrEx>
-          <w:tblCellMar>
-            <w:top w:w="0" w:type="dxa"/>
-            <w:bottom w:w="0" w:type="dxa"/>
-          </w:tblCellMar>
-        </w:tblPrEx>
         <w:tc>
           <w:tcPr>
             <w:tcW w:w="2500" w:type="dxa"/>
@@ -3128,12 +2906,6 @@
         <w:gridCol w:w="6526"/>
       </w:tblGrid>
       <w:tr>
-        <w:tblPrEx>
-          <w:tblCellMar>
-            <w:top w:w="0" w:type="dxa"/>
-            <w:bottom w:w="0" w:type="dxa"/>
-          </w:tblCellMar>
-        </w:tblPrEx>
         <w:trPr>
           <w:tblHeader/>
         </w:trPr>
@@ -3196,12 +2968,6 @@
         </w:tc>
       </w:tr>
       <w:tr>
-        <w:tblPrEx>
-          <w:tblCellMar>
-            <w:top w:w="0" w:type="dxa"/>
-            <w:bottom w:w="0" w:type="dxa"/>
-          </w:tblCellMar>
-        </w:tblPrEx>
         <w:tc>
           <w:tcPr>
             <w:tcW w:w="2500" w:type="dxa"/>
@@ -3250,12 +3016,6 @@
         </w:tc>
       </w:tr>
       <w:tr>
-        <w:tblPrEx>
-          <w:tblCellMar>
-            <w:top w:w="0" w:type="dxa"/>
-            <w:bottom w:w="0" w:type="dxa"/>
-          </w:tblCellMar>
-        </w:tblPrEx>
         <w:tc>
           <w:tcPr>
             <w:tcW w:w="2500" w:type="dxa"/>
@@ -3304,12 +3064,6 @@
         </w:tc>
       </w:tr>
       <w:tr>
-        <w:tblPrEx>
-          <w:tblCellMar>
-            <w:top w:w="0" w:type="dxa"/>
-            <w:bottom w:w="0" w:type="dxa"/>
-          </w:tblCellMar>
-        </w:tblPrEx>
         <w:tc>
           <w:tcPr>
             <w:tcW w:w="2500" w:type="dxa"/>
@@ -3358,12 +3112,6 @@
         </w:tc>
       </w:tr>
       <w:tr>
-        <w:tblPrEx>
-          <w:tblCellMar>
-            <w:top w:w="0" w:type="dxa"/>
-            <w:bottom w:w="0" w:type="dxa"/>
-          </w:tblCellMar>
-        </w:tblPrEx>
         <w:tc>
           <w:tcPr>
             <w:tcW w:w="2500" w:type="dxa"/>
@@ -3412,12 +3160,6 @@
         </w:tc>
       </w:tr>
       <w:tr>
-        <w:tblPrEx>
-          <w:tblCellMar>
-            <w:top w:w="0" w:type="dxa"/>
-            <w:bottom w:w="0" w:type="dxa"/>
-          </w:tblCellMar>
-        </w:tblPrEx>
         <w:tc>
           <w:tcPr>
             <w:tcW w:w="2500" w:type="dxa"/>
@@ -3466,12 +3208,6 @@
         </w:tc>
       </w:tr>
       <w:tr>
-        <w:tblPrEx>
-          <w:tblCellMar>
-            <w:top w:w="0" w:type="dxa"/>
-            <w:bottom w:w="0" w:type="dxa"/>
-          </w:tblCellMar>
-        </w:tblPrEx>
         <w:tc>
           <w:tcPr>
             <w:tcW w:w="2500" w:type="dxa"/>
@@ -3811,12 +3547,6 @@
         <w:gridCol w:w="2026"/>
       </w:tblGrid>
       <w:tr>
-        <w:tblPrEx>
-          <w:tblCellMar>
-            <w:top w:w="0" w:type="dxa"/>
-            <w:bottom w:w="0" w:type="dxa"/>
-          </w:tblCellMar>
-        </w:tblPrEx>
         <w:trPr>
           <w:tblHeader/>
         </w:trPr>
@@ -3906,12 +3636,6 @@
         </w:tc>
       </w:tr>
       <w:tr>
-        <w:tblPrEx>
-          <w:tblCellMar>
-            <w:top w:w="0" w:type="dxa"/>
-            <w:bottom w:w="0" w:type="dxa"/>
-          </w:tblCellMar>
-        </w:tblPrEx>
         <w:tc>
           <w:tcPr>
             <w:tcW w:w="2000" w:type="dxa"/>
@@ -3983,12 +3707,6 @@
         </w:tc>
       </w:tr>
       <w:tr>
-        <w:tblPrEx>
-          <w:tblCellMar>
-            <w:top w:w="0" w:type="dxa"/>
-            <w:bottom w:w="0" w:type="dxa"/>
-          </w:tblCellMar>
-        </w:tblPrEx>
         <w:tc>
           <w:tcPr>
             <w:tcW w:w="2000" w:type="dxa"/>
@@ -4060,12 +3778,6 @@
         </w:tc>
       </w:tr>
       <w:tr>
-        <w:tblPrEx>
-          <w:tblCellMar>
-            <w:top w:w="0" w:type="dxa"/>
-            <w:bottom w:w="0" w:type="dxa"/>
-          </w:tblCellMar>
-        </w:tblPrEx>
         <w:tc>
           <w:tcPr>
             <w:tcW w:w="2000" w:type="dxa"/>
@@ -4183,12 +3895,6 @@
         <w:gridCol w:w="3513"/>
       </w:tblGrid>
       <w:tr>
-        <w:tblPrEx>
-          <w:tblCellMar>
-            <w:top w:w="0" w:type="dxa"/>
-            <w:bottom w:w="0" w:type="dxa"/>
-          </w:tblCellMar>
-        </w:tblPrEx>
         <w:trPr>
           <w:tblHeader/>
         </w:trPr>
@@ -4278,12 +3984,6 @@
         </w:tc>
       </w:tr>
       <w:tr>
-        <w:tblPrEx>
-          <w:tblCellMar>
-            <w:top w:w="0" w:type="dxa"/>
-            <w:bottom w:w="0" w:type="dxa"/>
-          </w:tblCellMar>
-        </w:tblPrEx>
         <w:tc>
           <w:tcPr>
             <w:tcW w:w="2000" w:type="dxa"/>
@@ -4355,12 +4055,6 @@
         </w:tc>
       </w:tr>
       <w:tr>
-        <w:tblPrEx>
-          <w:tblCellMar>
-            <w:top w:w="0" w:type="dxa"/>
-            <w:bottom w:w="0" w:type="dxa"/>
-          </w:tblCellMar>
-        </w:tblPrEx>
         <w:tc>
           <w:tcPr>
             <w:tcW w:w="2000" w:type="dxa"/>
@@ -4432,12 +4126,6 @@
         </w:tc>
       </w:tr>
       <w:tr>
-        <w:tblPrEx>
-          <w:tblCellMar>
-            <w:top w:w="0" w:type="dxa"/>
-            <w:bottom w:w="0" w:type="dxa"/>
-          </w:tblCellMar>
-        </w:tblPrEx>
         <w:tc>
           <w:tcPr>
             <w:tcW w:w="2000" w:type="dxa"/>
@@ -4509,12 +4197,6 @@
         </w:tc>
       </w:tr>
       <w:tr>
-        <w:tblPrEx>
-          <w:tblCellMar>
-            <w:top w:w="0" w:type="dxa"/>
-            <w:bottom w:w="0" w:type="dxa"/>
-          </w:tblCellMar>
-        </w:tblPrEx>
         <w:tc>
           <w:tcPr>
             <w:tcW w:w="2000" w:type="dxa"/>
@@ -4586,12 +4268,6 @@
         </w:tc>
       </w:tr>
       <w:tr>
-        <w:tblPrEx>
-          <w:tblCellMar>
-            <w:top w:w="0" w:type="dxa"/>
-            <w:bottom w:w="0" w:type="dxa"/>
-          </w:tblCellMar>
-        </w:tblPrEx>
         <w:tc>
           <w:tcPr>
             <w:tcW w:w="2000" w:type="dxa"/>
@@ -4663,12 +4339,6 @@
         </w:tc>
       </w:tr>
       <w:tr>
-        <w:tblPrEx>
-          <w:tblCellMar>
-            <w:top w:w="0" w:type="dxa"/>
-            <w:bottom w:w="0" w:type="dxa"/>
-          </w:tblCellMar>
-        </w:tblPrEx>
         <w:tc>
           <w:tcPr>
             <w:tcW w:w="2000" w:type="dxa"/>
@@ -4740,12 +4410,6 @@
         </w:tc>
       </w:tr>
       <w:tr>
-        <w:tblPrEx>
-          <w:tblCellMar>
-            <w:top w:w="0" w:type="dxa"/>
-            <w:bottom w:w="0" w:type="dxa"/>
-          </w:tblCellMar>
-        </w:tblPrEx>
         <w:tc>
           <w:tcPr>
             <w:tcW w:w="2000" w:type="dxa"/>
@@ -4817,12 +4481,6 @@
         </w:tc>
       </w:tr>
       <w:tr>
-        <w:tblPrEx>
-          <w:tblCellMar>
-            <w:top w:w="0" w:type="dxa"/>
-            <w:bottom w:w="0" w:type="dxa"/>
-          </w:tblCellMar>
-        </w:tblPrEx>
         <w:tc>
           <w:tcPr>
             <w:tcW w:w="2000" w:type="dxa"/>
@@ -4894,12 +4552,6 @@
         </w:tc>
       </w:tr>
       <w:tr>
-        <w:tblPrEx>
-          <w:tblCellMar>
-            <w:top w:w="0" w:type="dxa"/>
-            <w:bottom w:w="0" w:type="dxa"/>
-          </w:tblCellMar>
-        </w:tblPrEx>
         <w:tc>
           <w:tcPr>
             <w:tcW w:w="2000" w:type="dxa"/>
@@ -5002,12 +4654,6 @@
         <w:gridCol w:w="6026"/>
       </w:tblGrid>
       <w:tr>
-        <w:tblPrEx>
-          <w:tblCellMar>
-            <w:top w:w="0" w:type="dxa"/>
-            <w:bottom w:w="0" w:type="dxa"/>
-          </w:tblCellMar>
-        </w:tblPrEx>
         <w:trPr>
           <w:tblHeader/>
         </w:trPr>
@@ -5069,12 +4715,6 @@
         </w:tc>
       </w:tr>
       <w:tr>
-        <w:tblPrEx>
-          <w:tblCellMar>
-            <w:top w:w="0" w:type="dxa"/>
-            <w:bottom w:w="0" w:type="dxa"/>
-          </w:tblCellMar>
-        </w:tblPrEx>
         <w:tc>
           <w:tcPr>
             <w:tcW w:w="3000" w:type="dxa"/>
@@ -5123,12 +4763,6 @@
         </w:tc>
       </w:tr>
       <w:tr>
-        <w:tblPrEx>
-          <w:tblCellMar>
-            <w:top w:w="0" w:type="dxa"/>
-            <w:bottom w:w="0" w:type="dxa"/>
-          </w:tblCellMar>
-        </w:tblPrEx>
         <w:tc>
           <w:tcPr>
             <w:tcW w:w="3000" w:type="dxa"/>
@@ -5177,12 +4811,6 @@
         </w:tc>
       </w:tr>
       <w:tr>
-        <w:tblPrEx>
-          <w:tblCellMar>
-            <w:top w:w="0" w:type="dxa"/>
-            <w:bottom w:w="0" w:type="dxa"/>
-          </w:tblCellMar>
-        </w:tblPrEx>
         <w:tc>
           <w:tcPr>
             <w:tcW w:w="3000" w:type="dxa"/>
@@ -5231,12 +4859,6 @@
         </w:tc>
       </w:tr>
       <w:tr>
-        <w:tblPrEx>
-          <w:tblCellMar>
-            <w:top w:w="0" w:type="dxa"/>
-            <w:bottom w:w="0" w:type="dxa"/>
-          </w:tblCellMar>
-        </w:tblPrEx>
         <w:tc>
           <w:tcPr>
             <w:tcW w:w="3000" w:type="dxa"/>
@@ -5317,12 +4939,6 @@
         <w:gridCol w:w="3026"/>
       </w:tblGrid>
       <w:tr>
-        <w:tblPrEx>
-          <w:tblCellMar>
-            <w:top w:w="0" w:type="dxa"/>
-            <w:bottom w:w="0" w:type="dxa"/>
-          </w:tblCellMar>
-        </w:tblPrEx>
         <w:trPr>
           <w:tblHeader/>
         </w:trPr>
@@ -5412,12 +5028,6 @@
         </w:tc>
       </w:tr>
       <w:tr>
-        <w:tblPrEx>
-          <w:tblCellMar>
-            <w:top w:w="0" w:type="dxa"/>
-            <w:bottom w:w="0" w:type="dxa"/>
-          </w:tblCellMar>
-        </w:tblPrEx>
         <w:tc>
           <w:tcPr>
             <w:tcW w:w="2500" w:type="dxa"/>
@@ -5489,12 +5099,6 @@
         </w:tc>
       </w:tr>
       <w:tr>
-        <w:tblPrEx>
-          <w:tblCellMar>
-            <w:top w:w="0" w:type="dxa"/>
-            <w:bottom w:w="0" w:type="dxa"/>
-          </w:tblCellMar>
-        </w:tblPrEx>
         <w:tc>
           <w:tcPr>
             <w:tcW w:w="2500" w:type="dxa"/>
@@ -5566,12 +5170,6 @@
         </w:tc>
       </w:tr>
       <w:tr>
-        <w:tblPrEx>
-          <w:tblCellMar>
-            <w:top w:w="0" w:type="dxa"/>
-            <w:bottom w:w="0" w:type="dxa"/>
-          </w:tblCellMar>
-        </w:tblPrEx>
         <w:tc>
           <w:tcPr>
             <w:tcW w:w="2500" w:type="dxa"/>
@@ -5688,12 +5286,6 @@
         <w:gridCol w:w="6826"/>
       </w:tblGrid>
       <w:tr>
-        <w:tblPrEx>
-          <w:tblCellMar>
-            <w:top w:w="0" w:type="dxa"/>
-            <w:bottom w:w="0" w:type="dxa"/>
-          </w:tblCellMar>
-        </w:tblPrEx>
         <w:tc>
           <w:tcPr>
             <w:tcW w:w="2200" w:type="dxa"/>
@@ -5746,12 +5338,6 @@
         </w:tc>
       </w:tr>
       <w:tr>
-        <w:tblPrEx>
-          <w:tblCellMar>
-            <w:top w:w="0" w:type="dxa"/>
-            <w:bottom w:w="0" w:type="dxa"/>
-          </w:tblCellMar>
-        </w:tblPrEx>
         <w:tc>
           <w:tcPr>
             <w:tcW w:w="2200" w:type="dxa"/>
@@ -5804,12 +5390,6 @@
         </w:tc>
       </w:tr>
       <w:tr>
-        <w:tblPrEx>
-          <w:tblCellMar>
-            <w:top w:w="0" w:type="dxa"/>
-            <w:bottom w:w="0" w:type="dxa"/>
-          </w:tblCellMar>
-        </w:tblPrEx>
         <w:tc>
           <w:tcPr>
             <w:tcW w:w="2200" w:type="dxa"/>
@@ -5862,12 +5442,6 @@
         </w:tc>
       </w:tr>
       <w:tr>
-        <w:tblPrEx>
-          <w:tblCellMar>
-            <w:top w:w="0" w:type="dxa"/>
-            <w:bottom w:w="0" w:type="dxa"/>
-          </w:tblCellMar>
-        </w:tblPrEx>
         <w:tc>
           <w:tcPr>
             <w:tcW w:w="2200" w:type="dxa"/>
@@ -5943,12 +5517,6 @@
         <w:gridCol w:w="6826"/>
       </w:tblGrid>
       <w:tr>
-        <w:tblPrEx>
-          <w:tblCellMar>
-            <w:top w:w="0" w:type="dxa"/>
-            <w:bottom w:w="0" w:type="dxa"/>
-          </w:tblCellMar>
-        </w:tblPrEx>
         <w:tc>
           <w:tcPr>
             <w:tcW w:w="2200" w:type="dxa"/>
@@ -6001,12 +5569,6 @@
         </w:tc>
       </w:tr>
       <w:tr>
-        <w:tblPrEx>
-          <w:tblCellMar>
-            <w:top w:w="0" w:type="dxa"/>
-            <w:bottom w:w="0" w:type="dxa"/>
-          </w:tblCellMar>
-        </w:tblPrEx>
         <w:tc>
           <w:tcPr>
             <w:tcW w:w="2200" w:type="dxa"/>
@@ -6059,12 +5621,6 @@
         </w:tc>
       </w:tr>
       <w:tr>
-        <w:tblPrEx>
-          <w:tblCellMar>
-            <w:top w:w="0" w:type="dxa"/>
-            <w:bottom w:w="0" w:type="dxa"/>
-          </w:tblCellMar>
-        </w:tblPrEx>
         <w:tc>
           <w:tcPr>
             <w:tcW w:w="2200" w:type="dxa"/>
@@ -6117,12 +5673,6 @@
         </w:tc>
       </w:tr>
       <w:tr>
-        <w:tblPrEx>
-          <w:tblCellMar>
-            <w:top w:w="0" w:type="dxa"/>
-            <w:bottom w:w="0" w:type="dxa"/>
-          </w:tblCellMar>
-        </w:tblPrEx>
         <w:tc>
           <w:tcPr>
             <w:tcW w:w="2200" w:type="dxa"/>
@@ -6198,12 +5748,6 @@
         <w:gridCol w:w="6826"/>
       </w:tblGrid>
       <w:tr>
-        <w:tblPrEx>
-          <w:tblCellMar>
-            <w:top w:w="0" w:type="dxa"/>
-            <w:bottom w:w="0" w:type="dxa"/>
-          </w:tblCellMar>
-        </w:tblPrEx>
         <w:tc>
           <w:tcPr>
             <w:tcW w:w="2200" w:type="dxa"/>
@@ -6256,12 +5800,6 @@
         </w:tc>
       </w:tr>
       <w:tr>
-        <w:tblPrEx>
-          <w:tblCellMar>
-            <w:top w:w="0" w:type="dxa"/>
-            <w:bottom w:w="0" w:type="dxa"/>
-          </w:tblCellMar>
-        </w:tblPrEx>
         <w:tc>
           <w:tcPr>
             <w:tcW w:w="2200" w:type="dxa"/>
@@ -6314,12 +5852,6 @@
         </w:tc>
       </w:tr>
       <w:tr>
-        <w:tblPrEx>
-          <w:tblCellMar>
-            <w:top w:w="0" w:type="dxa"/>
-            <w:bottom w:w="0" w:type="dxa"/>
-          </w:tblCellMar>
-        </w:tblPrEx>
         <w:tc>
           <w:tcPr>
             <w:tcW w:w="2200" w:type="dxa"/>
@@ -6372,12 +5904,6 @@
         </w:tc>
       </w:tr>
       <w:tr>
-        <w:tblPrEx>
-          <w:tblCellMar>
-            <w:top w:w="0" w:type="dxa"/>
-            <w:bottom w:w="0" w:type="dxa"/>
-          </w:tblCellMar>
-        </w:tblPrEx>
         <w:tc>
           <w:tcPr>
             <w:tcW w:w="2200" w:type="dxa"/>
@@ -6461,12 +5987,6 @@
         <w:gridCol w:w="6826"/>
       </w:tblGrid>
       <w:tr>
-        <w:tblPrEx>
-          <w:tblCellMar>
-            <w:top w:w="0" w:type="dxa"/>
-            <w:bottom w:w="0" w:type="dxa"/>
-          </w:tblCellMar>
-        </w:tblPrEx>
         <w:tc>
           <w:tcPr>
             <w:tcW w:w="2200" w:type="dxa"/>
@@ -6519,12 +6039,6 @@
         </w:tc>
       </w:tr>
       <w:tr>
-        <w:tblPrEx>
-          <w:tblCellMar>
-            <w:top w:w="0" w:type="dxa"/>
-            <w:bottom w:w="0" w:type="dxa"/>
-          </w:tblCellMar>
-        </w:tblPrEx>
         <w:tc>
           <w:tcPr>
             <w:tcW w:w="2200" w:type="dxa"/>
@@ -6577,12 +6091,6 @@
         </w:tc>
       </w:tr>
       <w:tr>
-        <w:tblPrEx>
-          <w:tblCellMar>
-            <w:top w:w="0" w:type="dxa"/>
-            <w:bottom w:w="0" w:type="dxa"/>
-          </w:tblCellMar>
-        </w:tblPrEx>
         <w:tc>
           <w:tcPr>
             <w:tcW w:w="2200" w:type="dxa"/>
@@ -6635,12 +6143,6 @@
         </w:tc>
       </w:tr>
       <w:tr>
-        <w:tblPrEx>
-          <w:tblCellMar>
-            <w:top w:w="0" w:type="dxa"/>
-            <w:bottom w:w="0" w:type="dxa"/>
-          </w:tblCellMar>
-        </w:tblPrEx>
         <w:tc>
           <w:tcPr>
             <w:tcW w:w="2200" w:type="dxa"/>
@@ -6716,12 +6218,6 @@
         <w:gridCol w:w="6826"/>
       </w:tblGrid>
       <w:tr>
-        <w:tblPrEx>
-          <w:tblCellMar>
-            <w:top w:w="0" w:type="dxa"/>
-            <w:bottom w:w="0" w:type="dxa"/>
-          </w:tblCellMar>
-        </w:tblPrEx>
         <w:tc>
           <w:tcPr>
             <w:tcW w:w="2200" w:type="dxa"/>
@@ -6774,12 +6270,6 @@
         </w:tc>
       </w:tr>
       <w:tr>
-        <w:tblPrEx>
-          <w:tblCellMar>
-            <w:top w:w="0" w:type="dxa"/>
-            <w:bottom w:w="0" w:type="dxa"/>
-          </w:tblCellMar>
-        </w:tblPrEx>
         <w:tc>
           <w:tcPr>
             <w:tcW w:w="2200" w:type="dxa"/>
@@ -6832,12 +6322,6 @@
         </w:tc>
       </w:tr>
       <w:tr>
-        <w:tblPrEx>
-          <w:tblCellMar>
-            <w:top w:w="0" w:type="dxa"/>
-            <w:bottom w:w="0" w:type="dxa"/>
-          </w:tblCellMar>
-        </w:tblPrEx>
         <w:tc>
           <w:tcPr>
             <w:tcW w:w="2200" w:type="dxa"/>
@@ -6890,12 +6374,6 @@
         </w:tc>
       </w:tr>
       <w:tr>
-        <w:tblPrEx>
-          <w:tblCellMar>
-            <w:top w:w="0" w:type="dxa"/>
-            <w:bottom w:w="0" w:type="dxa"/>
-          </w:tblCellMar>
-        </w:tblPrEx>
         <w:tc>
           <w:tcPr>
             <w:tcW w:w="2200" w:type="dxa"/>
@@ -6971,12 +6449,6 @@
         <w:gridCol w:w="6826"/>
       </w:tblGrid>
       <w:tr>
-        <w:tblPrEx>
-          <w:tblCellMar>
-            <w:top w:w="0" w:type="dxa"/>
-            <w:bottom w:w="0" w:type="dxa"/>
-          </w:tblCellMar>
-        </w:tblPrEx>
         <w:tc>
           <w:tcPr>
             <w:tcW w:w="2200" w:type="dxa"/>
@@ -7030,12 +6502,6 @@
         </w:tc>
       </w:tr>
       <w:tr>
-        <w:tblPrEx>
-          <w:tblCellMar>
-            <w:top w:w="0" w:type="dxa"/>
-            <w:bottom w:w="0" w:type="dxa"/>
-          </w:tblCellMar>
-        </w:tblPrEx>
         <w:tc>
           <w:tcPr>
             <w:tcW w:w="2200" w:type="dxa"/>
@@ -7088,12 +6554,6 @@
         </w:tc>
       </w:tr>
       <w:tr>
-        <w:tblPrEx>
-          <w:tblCellMar>
-            <w:top w:w="0" w:type="dxa"/>
-            <w:bottom w:w="0" w:type="dxa"/>
-          </w:tblCellMar>
-        </w:tblPrEx>
         <w:tc>
           <w:tcPr>
             <w:tcW w:w="2200" w:type="dxa"/>
@@ -7146,12 +6606,6 @@
         </w:tc>
       </w:tr>
       <w:tr>
-        <w:tblPrEx>
-          <w:tblCellMar>
-            <w:top w:w="0" w:type="dxa"/>
-            <w:bottom w:w="0" w:type="dxa"/>
-          </w:tblCellMar>
-        </w:tblPrEx>
         <w:tc>
           <w:tcPr>
             <w:tcW w:w="2200" w:type="dxa"/>
@@ -7227,12 +6681,6 @@
         <w:gridCol w:w="6826"/>
       </w:tblGrid>
       <w:tr>
-        <w:tblPrEx>
-          <w:tblCellMar>
-            <w:top w:w="0" w:type="dxa"/>
-            <w:bottom w:w="0" w:type="dxa"/>
-          </w:tblCellMar>
-        </w:tblPrEx>
         <w:tc>
           <w:tcPr>
             <w:tcW w:w="2200" w:type="dxa"/>
@@ -7285,12 +6733,6 @@
         </w:tc>
       </w:tr>
       <w:tr>
-        <w:tblPrEx>
-          <w:tblCellMar>
-            <w:top w:w="0" w:type="dxa"/>
-            <w:bottom w:w="0" w:type="dxa"/>
-          </w:tblCellMar>
-        </w:tblPrEx>
         <w:tc>
           <w:tcPr>
             <w:tcW w:w="2200" w:type="dxa"/>
@@ -7343,12 +6785,6 @@
         </w:tc>
       </w:tr>
       <w:tr>
-        <w:tblPrEx>
-          <w:tblCellMar>
-            <w:top w:w="0" w:type="dxa"/>
-            <w:bottom w:w="0" w:type="dxa"/>
-          </w:tblCellMar>
-        </w:tblPrEx>
         <w:tc>
           <w:tcPr>
             <w:tcW w:w="2200" w:type="dxa"/>
@@ -7401,12 +6837,6 @@
         </w:tc>
       </w:tr>
       <w:tr>
-        <w:tblPrEx>
-          <w:tblCellMar>
-            <w:top w:w="0" w:type="dxa"/>
-            <w:bottom w:w="0" w:type="dxa"/>
-          </w:tblCellMar>
-        </w:tblPrEx>
         <w:tc>
           <w:tcPr>
             <w:tcW w:w="2200" w:type="dxa"/>
@@ -7490,12 +6920,6 @@
         <w:gridCol w:w="6826"/>
       </w:tblGrid>
       <w:tr>
-        <w:tblPrEx>
-          <w:tblCellMar>
-            <w:top w:w="0" w:type="dxa"/>
-            <w:bottom w:w="0" w:type="dxa"/>
-          </w:tblCellMar>
-        </w:tblPrEx>
         <w:tc>
           <w:tcPr>
             <w:tcW w:w="2200" w:type="dxa"/>
@@ -7548,12 +6972,6 @@
         </w:tc>
       </w:tr>
       <w:tr>
-        <w:tblPrEx>
-          <w:tblCellMar>
-            <w:top w:w="0" w:type="dxa"/>
-            <w:bottom w:w="0" w:type="dxa"/>
-          </w:tblCellMar>
-        </w:tblPrEx>
         <w:tc>
           <w:tcPr>
             <w:tcW w:w="2200" w:type="dxa"/>
@@ -7606,12 +7024,6 @@
         </w:tc>
       </w:tr>
       <w:tr>
-        <w:tblPrEx>
-          <w:tblCellMar>
-            <w:top w:w="0" w:type="dxa"/>
-            <w:bottom w:w="0" w:type="dxa"/>
-          </w:tblCellMar>
-        </w:tblPrEx>
         <w:tc>
           <w:tcPr>
             <w:tcW w:w="2200" w:type="dxa"/>
@@ -7664,12 +7076,6 @@
         </w:tc>
       </w:tr>
       <w:tr>
-        <w:tblPrEx>
-          <w:tblCellMar>
-            <w:top w:w="0" w:type="dxa"/>
-            <w:bottom w:w="0" w:type="dxa"/>
-          </w:tblCellMar>
-        </w:tblPrEx>
         <w:tc>
           <w:tcPr>
             <w:tcW w:w="2200" w:type="dxa"/>
@@ -7745,12 +7151,6 @@
         <w:gridCol w:w="6826"/>
       </w:tblGrid>
       <w:tr>
-        <w:tblPrEx>
-          <w:tblCellMar>
-            <w:top w:w="0" w:type="dxa"/>
-            <w:bottom w:w="0" w:type="dxa"/>
-          </w:tblCellMar>
-        </w:tblPrEx>
         <w:tc>
           <w:tcPr>
             <w:tcW w:w="2200" w:type="dxa"/>
@@ -7803,12 +7203,6 @@
         </w:tc>
       </w:tr>
       <w:tr>
-        <w:tblPrEx>
-          <w:tblCellMar>
-            <w:top w:w="0" w:type="dxa"/>
-            <w:bottom w:w="0" w:type="dxa"/>
-          </w:tblCellMar>
-        </w:tblPrEx>
         <w:tc>
           <w:tcPr>
             <w:tcW w:w="2200" w:type="dxa"/>
@@ -7861,12 +7255,6 @@
         </w:tc>
       </w:tr>
       <w:tr>
-        <w:tblPrEx>
-          <w:tblCellMar>
-            <w:top w:w="0" w:type="dxa"/>
-            <w:bottom w:w="0" w:type="dxa"/>
-          </w:tblCellMar>
-        </w:tblPrEx>
         <w:tc>
           <w:tcPr>
             <w:tcW w:w="2200" w:type="dxa"/>
@@ -7919,12 +7307,6 @@
         </w:tc>
       </w:tr>
       <w:tr>
-        <w:tblPrEx>
-          <w:tblCellMar>
-            <w:top w:w="0" w:type="dxa"/>
-            <w:bottom w:w="0" w:type="dxa"/>
-          </w:tblCellMar>
-        </w:tblPrEx>
         <w:tc>
           <w:tcPr>
             <w:tcW w:w="2200" w:type="dxa"/>
@@ -8008,12 +7390,6 @@
         <w:gridCol w:w="6826"/>
       </w:tblGrid>
       <w:tr>
-        <w:tblPrEx>
-          <w:tblCellMar>
-            <w:top w:w="0" w:type="dxa"/>
-            <w:bottom w:w="0" w:type="dxa"/>
-          </w:tblCellMar>
-        </w:tblPrEx>
         <w:tc>
           <w:tcPr>
             <w:tcW w:w="2200" w:type="dxa"/>
@@ -8066,12 +7442,6 @@
         </w:tc>
       </w:tr>
       <w:tr>
-        <w:tblPrEx>
-          <w:tblCellMar>
-            <w:top w:w="0" w:type="dxa"/>
-            <w:bottom w:w="0" w:type="dxa"/>
-          </w:tblCellMar>
-        </w:tblPrEx>
         <w:tc>
           <w:tcPr>
             <w:tcW w:w="2200" w:type="dxa"/>
@@ -8124,12 +7494,6 @@
         </w:tc>
       </w:tr>
       <w:tr>
-        <w:tblPrEx>
-          <w:tblCellMar>
-            <w:top w:w="0" w:type="dxa"/>
-            <w:bottom w:w="0" w:type="dxa"/>
-          </w:tblCellMar>
-        </w:tblPrEx>
         <w:tc>
           <w:tcPr>
             <w:tcW w:w="2200" w:type="dxa"/>
@@ -8182,12 +7546,6 @@
         </w:tc>
       </w:tr>
       <w:tr>
-        <w:tblPrEx>
-          <w:tblCellMar>
-            <w:top w:w="0" w:type="dxa"/>
-            <w:bottom w:w="0" w:type="dxa"/>
-          </w:tblCellMar>
-        </w:tblPrEx>
         <w:tc>
           <w:tcPr>
             <w:tcW w:w="2200" w:type="dxa"/>
@@ -8263,12 +7621,6 @@
         <w:gridCol w:w="6826"/>
       </w:tblGrid>
       <w:tr>
-        <w:tblPrEx>
-          <w:tblCellMar>
-            <w:top w:w="0" w:type="dxa"/>
-            <w:bottom w:w="0" w:type="dxa"/>
-          </w:tblCellMar>
-        </w:tblPrEx>
         <w:tc>
           <w:tcPr>
             <w:tcW w:w="2200" w:type="dxa"/>
@@ -8322,12 +7674,6 @@
         </w:tc>
       </w:tr>
       <w:tr>
-        <w:tblPrEx>
-          <w:tblCellMar>
-            <w:top w:w="0" w:type="dxa"/>
-            <w:bottom w:w="0" w:type="dxa"/>
-          </w:tblCellMar>
-        </w:tblPrEx>
         <w:tc>
           <w:tcPr>
             <w:tcW w:w="2200" w:type="dxa"/>
@@ -8380,12 +7726,6 @@
         </w:tc>
       </w:tr>
       <w:tr>
-        <w:tblPrEx>
-          <w:tblCellMar>
-            <w:top w:w="0" w:type="dxa"/>
-            <w:bottom w:w="0" w:type="dxa"/>
-          </w:tblCellMar>
-        </w:tblPrEx>
         <w:tc>
           <w:tcPr>
             <w:tcW w:w="2200" w:type="dxa"/>
@@ -8438,12 +7778,6 @@
         </w:tc>
       </w:tr>
       <w:tr>
-        <w:tblPrEx>
-          <w:tblCellMar>
-            <w:top w:w="0" w:type="dxa"/>
-            <w:bottom w:w="0" w:type="dxa"/>
-          </w:tblCellMar>
-        </w:tblPrEx>
         <w:tc>
           <w:tcPr>
             <w:tcW w:w="2200" w:type="dxa"/>
@@ -8519,12 +7853,6 @@
         <w:gridCol w:w="6826"/>
       </w:tblGrid>
       <w:tr>
-        <w:tblPrEx>
-          <w:tblCellMar>
-            <w:top w:w="0" w:type="dxa"/>
-            <w:bottom w:w="0" w:type="dxa"/>
-          </w:tblCellMar>
-        </w:tblPrEx>
         <w:tc>
           <w:tcPr>
             <w:tcW w:w="2200" w:type="dxa"/>
@@ -8577,12 +7905,6 @@
         </w:tc>
       </w:tr>
       <w:tr>
-        <w:tblPrEx>
-          <w:tblCellMar>
-            <w:top w:w="0" w:type="dxa"/>
-            <w:bottom w:w="0" w:type="dxa"/>
-          </w:tblCellMar>
-        </w:tblPrEx>
         <w:tc>
           <w:tcPr>
             <w:tcW w:w="2200" w:type="dxa"/>
@@ -8635,12 +7957,6 @@
         </w:tc>
       </w:tr>
       <w:tr>
-        <w:tblPrEx>
-          <w:tblCellMar>
-            <w:top w:w="0" w:type="dxa"/>
-            <w:bottom w:w="0" w:type="dxa"/>
-          </w:tblCellMar>
-        </w:tblPrEx>
         <w:tc>
           <w:tcPr>
             <w:tcW w:w="2200" w:type="dxa"/>
@@ -8693,12 +8009,6 @@
         </w:tc>
       </w:tr>
       <w:tr>
-        <w:tblPrEx>
-          <w:tblCellMar>
-            <w:top w:w="0" w:type="dxa"/>
-            <w:bottom w:w="0" w:type="dxa"/>
-          </w:tblCellMar>
-        </w:tblPrEx>
         <w:tc>
           <w:tcPr>
             <w:tcW w:w="2200" w:type="dxa"/>
@@ -8796,12 +8106,6 @@
         <w:gridCol w:w="6826"/>
       </w:tblGrid>
       <w:tr>
-        <w:tblPrEx>
-          <w:tblCellMar>
-            <w:top w:w="0" w:type="dxa"/>
-            <w:bottom w:w="0" w:type="dxa"/>
-          </w:tblCellMar>
-        </w:tblPrEx>
         <w:tc>
           <w:tcPr>
             <w:tcW w:w="2200" w:type="dxa"/>
@@ -8854,12 +8158,6 @@
         </w:tc>
       </w:tr>
       <w:tr>
-        <w:tblPrEx>
-          <w:tblCellMar>
-            <w:top w:w="0" w:type="dxa"/>
-            <w:bottom w:w="0" w:type="dxa"/>
-          </w:tblCellMar>
-        </w:tblPrEx>
         <w:tc>
           <w:tcPr>
             <w:tcW w:w="2200" w:type="dxa"/>
@@ -8912,12 +8210,6 @@
         </w:tc>
       </w:tr>
       <w:tr>
-        <w:tblPrEx>
-          <w:tblCellMar>
-            <w:top w:w="0" w:type="dxa"/>
-            <w:bottom w:w="0" w:type="dxa"/>
-          </w:tblCellMar>
-        </w:tblPrEx>
         <w:tc>
           <w:tcPr>
             <w:tcW w:w="2200" w:type="dxa"/>
@@ -8970,12 +8262,6 @@
         </w:tc>
       </w:tr>
       <w:tr>
-        <w:tblPrEx>
-          <w:tblCellMar>
-            <w:top w:w="0" w:type="dxa"/>
-            <w:bottom w:w="0" w:type="dxa"/>
-          </w:tblCellMar>
-        </w:tblPrEx>
         <w:tc>
           <w:tcPr>
             <w:tcW w:w="2200" w:type="dxa"/>
@@ -9051,12 +8337,6 @@
         <w:gridCol w:w="6826"/>
       </w:tblGrid>
       <w:tr>
-        <w:tblPrEx>
-          <w:tblCellMar>
-            <w:top w:w="0" w:type="dxa"/>
-            <w:bottom w:w="0" w:type="dxa"/>
-          </w:tblCellMar>
-        </w:tblPrEx>
         <w:tc>
           <w:tcPr>
             <w:tcW w:w="2200" w:type="dxa"/>
@@ -9109,12 +8389,6 @@
         </w:tc>
       </w:tr>
       <w:tr>
-        <w:tblPrEx>
-          <w:tblCellMar>
-            <w:top w:w="0" w:type="dxa"/>
-            <w:bottom w:w="0" w:type="dxa"/>
-          </w:tblCellMar>
-        </w:tblPrEx>
         <w:tc>
           <w:tcPr>
             <w:tcW w:w="2200" w:type="dxa"/>
@@ -9167,12 +8441,6 @@
         </w:tc>
       </w:tr>
       <w:tr>
-        <w:tblPrEx>
-          <w:tblCellMar>
-            <w:top w:w="0" w:type="dxa"/>
-            <w:bottom w:w="0" w:type="dxa"/>
-          </w:tblCellMar>
-        </w:tblPrEx>
         <w:tc>
           <w:tcPr>
             <w:tcW w:w="2200" w:type="dxa"/>
@@ -9225,12 +8493,6 @@
         </w:tc>
       </w:tr>
       <w:tr>
-        <w:tblPrEx>
-          <w:tblCellMar>
-            <w:top w:w="0" w:type="dxa"/>
-            <w:bottom w:w="0" w:type="dxa"/>
-          </w:tblCellMar>
-        </w:tblPrEx>
         <w:tc>
           <w:tcPr>
             <w:tcW w:w="2200" w:type="dxa"/>
@@ -9314,12 +8576,6 @@
         <w:gridCol w:w="6826"/>
       </w:tblGrid>
       <w:tr>
-        <w:tblPrEx>
-          <w:tblCellMar>
-            <w:top w:w="0" w:type="dxa"/>
-            <w:bottom w:w="0" w:type="dxa"/>
-          </w:tblCellMar>
-        </w:tblPrEx>
         <w:tc>
           <w:tcPr>
             <w:tcW w:w="2200" w:type="dxa"/>
@@ -9372,12 +8628,6 @@
         </w:tc>
       </w:tr>
       <w:tr>
-        <w:tblPrEx>
-          <w:tblCellMar>
-            <w:top w:w="0" w:type="dxa"/>
-            <w:bottom w:w="0" w:type="dxa"/>
-          </w:tblCellMar>
-        </w:tblPrEx>
         <w:tc>
           <w:tcPr>
             <w:tcW w:w="2200" w:type="dxa"/>
@@ -9430,12 +8680,6 @@
         </w:tc>
       </w:tr>
       <w:tr>
-        <w:tblPrEx>
-          <w:tblCellMar>
-            <w:top w:w="0" w:type="dxa"/>
-            <w:bottom w:w="0" w:type="dxa"/>
-          </w:tblCellMar>
-        </w:tblPrEx>
         <w:tc>
           <w:tcPr>
             <w:tcW w:w="2200" w:type="dxa"/>
@@ -9488,12 +8732,6 @@
         </w:tc>
       </w:tr>
       <w:tr>
-        <w:tblPrEx>
-          <w:tblCellMar>
-            <w:top w:w="0" w:type="dxa"/>
-            <w:bottom w:w="0" w:type="dxa"/>
-          </w:tblCellMar>
-        </w:tblPrEx>
         <w:tc>
           <w:tcPr>
             <w:tcW w:w="2200" w:type="dxa"/>
@@ -9569,12 +8807,6 @@
         <w:gridCol w:w="6826"/>
       </w:tblGrid>
       <w:tr>
-        <w:tblPrEx>
-          <w:tblCellMar>
-            <w:top w:w="0" w:type="dxa"/>
-            <w:bottom w:w="0" w:type="dxa"/>
-          </w:tblCellMar>
-        </w:tblPrEx>
         <w:tc>
           <w:tcPr>
             <w:tcW w:w="2200" w:type="dxa"/>
@@ -9627,12 +8859,6 @@
         </w:tc>
       </w:tr>
       <w:tr>
-        <w:tblPrEx>
-          <w:tblCellMar>
-            <w:top w:w="0" w:type="dxa"/>
-            <w:bottom w:w="0" w:type="dxa"/>
-          </w:tblCellMar>
-        </w:tblPrEx>
         <w:tc>
           <w:tcPr>
             <w:tcW w:w="2200" w:type="dxa"/>
@@ -9685,12 +8911,6 @@
         </w:tc>
       </w:tr>
       <w:tr>
-        <w:tblPrEx>
-          <w:tblCellMar>
-            <w:top w:w="0" w:type="dxa"/>
-            <w:bottom w:w="0" w:type="dxa"/>
-          </w:tblCellMar>
-        </w:tblPrEx>
         <w:tc>
           <w:tcPr>
             <w:tcW w:w="2200" w:type="dxa"/>
@@ -9743,12 +8963,6 @@
         </w:tc>
       </w:tr>
       <w:tr>
-        <w:tblPrEx>
-          <w:tblCellMar>
-            <w:top w:w="0" w:type="dxa"/>
-            <w:bottom w:w="0" w:type="dxa"/>
-          </w:tblCellMar>
-        </w:tblPrEx>
         <w:tc>
           <w:tcPr>
             <w:tcW w:w="2200" w:type="dxa"/>
@@ -9824,12 +9038,6 @@
         <w:gridCol w:w="6826"/>
       </w:tblGrid>
       <w:tr>
-        <w:tblPrEx>
-          <w:tblCellMar>
-            <w:top w:w="0" w:type="dxa"/>
-            <w:bottom w:w="0" w:type="dxa"/>
-          </w:tblCellMar>
-        </w:tblPrEx>
         <w:tc>
           <w:tcPr>
             <w:tcW w:w="2200" w:type="dxa"/>
@@ -9882,12 +9090,6 @@
         </w:tc>
       </w:tr>
       <w:tr>
-        <w:tblPrEx>
-          <w:tblCellMar>
-            <w:top w:w="0" w:type="dxa"/>
-            <w:bottom w:w="0" w:type="dxa"/>
-          </w:tblCellMar>
-        </w:tblPrEx>
         <w:tc>
           <w:tcPr>
             <w:tcW w:w="2200" w:type="dxa"/>
@@ -9940,12 +9142,6 @@
         </w:tc>
       </w:tr>
       <w:tr>
-        <w:tblPrEx>
-          <w:tblCellMar>
-            <w:top w:w="0" w:type="dxa"/>
-            <w:bottom w:w="0" w:type="dxa"/>
-          </w:tblCellMar>
-        </w:tblPrEx>
         <w:tc>
           <w:tcPr>
             <w:tcW w:w="2200" w:type="dxa"/>
@@ -9998,12 +9194,6 @@
         </w:tc>
       </w:tr>
       <w:tr>
-        <w:tblPrEx>
-          <w:tblCellMar>
-            <w:top w:w="0" w:type="dxa"/>
-            <w:bottom w:w="0" w:type="dxa"/>
-          </w:tblCellMar>
-        </w:tblPrEx>
         <w:tc>
           <w:tcPr>
             <w:tcW w:w="2200" w:type="dxa"/>
@@ -10079,12 +9269,6 @@
         <w:gridCol w:w="6826"/>
       </w:tblGrid>
       <w:tr>
-        <w:tblPrEx>
-          <w:tblCellMar>
-            <w:top w:w="0" w:type="dxa"/>
-            <w:bottom w:w="0" w:type="dxa"/>
-          </w:tblCellMar>
-        </w:tblPrEx>
         <w:tc>
           <w:tcPr>
             <w:tcW w:w="2200" w:type="dxa"/>
@@ -10137,12 +9321,6 @@
         </w:tc>
       </w:tr>
       <w:tr>
-        <w:tblPrEx>
-          <w:tblCellMar>
-            <w:top w:w="0" w:type="dxa"/>
-            <w:bottom w:w="0" w:type="dxa"/>
-          </w:tblCellMar>
-        </w:tblPrEx>
         <w:tc>
           <w:tcPr>
             <w:tcW w:w="2200" w:type="dxa"/>
@@ -10195,12 +9373,6 @@
         </w:tc>
       </w:tr>
       <w:tr>
-        <w:tblPrEx>
-          <w:tblCellMar>
-            <w:top w:w="0" w:type="dxa"/>
-            <w:bottom w:w="0" w:type="dxa"/>
-          </w:tblCellMar>
-        </w:tblPrEx>
         <w:tc>
           <w:tcPr>
             <w:tcW w:w="2200" w:type="dxa"/>
@@ -10253,12 +9425,6 @@
         </w:tc>
       </w:tr>
       <w:tr>
-        <w:tblPrEx>
-          <w:tblCellMar>
-            <w:top w:w="0" w:type="dxa"/>
-            <w:bottom w:w="0" w:type="dxa"/>
-          </w:tblCellMar>
-        </w:tblPrEx>
         <w:tc>
           <w:tcPr>
             <w:tcW w:w="2200" w:type="dxa"/>
@@ -10334,12 +9500,6 @@
         <w:gridCol w:w="6826"/>
       </w:tblGrid>
       <w:tr>
-        <w:tblPrEx>
-          <w:tblCellMar>
-            <w:top w:w="0" w:type="dxa"/>
-            <w:bottom w:w="0" w:type="dxa"/>
-          </w:tblCellMar>
-        </w:tblPrEx>
         <w:tc>
           <w:tcPr>
             <w:tcW w:w="2200" w:type="dxa"/>
@@ -10392,12 +9552,6 @@
         </w:tc>
       </w:tr>
       <w:tr>
-        <w:tblPrEx>
-          <w:tblCellMar>
-            <w:top w:w="0" w:type="dxa"/>
-            <w:bottom w:w="0" w:type="dxa"/>
-          </w:tblCellMar>
-        </w:tblPrEx>
         <w:tc>
           <w:tcPr>
             <w:tcW w:w="2200" w:type="dxa"/>
@@ -10450,12 +9604,6 @@
         </w:tc>
       </w:tr>
       <w:tr>
-        <w:tblPrEx>
-          <w:tblCellMar>
-            <w:top w:w="0" w:type="dxa"/>
-            <w:bottom w:w="0" w:type="dxa"/>
-          </w:tblCellMar>
-        </w:tblPrEx>
         <w:tc>
           <w:tcPr>
             <w:tcW w:w="2200" w:type="dxa"/>
@@ -10508,12 +9656,6 @@
         </w:tc>
       </w:tr>
       <w:tr>
-        <w:tblPrEx>
-          <w:tblCellMar>
-            <w:top w:w="0" w:type="dxa"/>
-            <w:bottom w:w="0" w:type="dxa"/>
-          </w:tblCellMar>
-        </w:tblPrEx>
         <w:tc>
           <w:tcPr>
             <w:tcW w:w="2200" w:type="dxa"/>
@@ -10597,12 +9739,6 @@
         <w:gridCol w:w="6826"/>
       </w:tblGrid>
       <w:tr>
-        <w:tblPrEx>
-          <w:tblCellMar>
-            <w:top w:w="0" w:type="dxa"/>
-            <w:bottom w:w="0" w:type="dxa"/>
-          </w:tblCellMar>
-        </w:tblPrEx>
         <w:tc>
           <w:tcPr>
             <w:tcW w:w="2200" w:type="dxa"/>
@@ -10655,12 +9791,6 @@
         </w:tc>
       </w:tr>
       <w:tr>
-        <w:tblPrEx>
-          <w:tblCellMar>
-            <w:top w:w="0" w:type="dxa"/>
-            <w:bottom w:w="0" w:type="dxa"/>
-          </w:tblCellMar>
-        </w:tblPrEx>
         <w:tc>
           <w:tcPr>
             <w:tcW w:w="2200" w:type="dxa"/>
@@ -10713,12 +9843,6 @@
         </w:tc>
       </w:tr>
       <w:tr>
-        <w:tblPrEx>
-          <w:tblCellMar>
-            <w:top w:w="0" w:type="dxa"/>
-            <w:bottom w:w="0" w:type="dxa"/>
-          </w:tblCellMar>
-        </w:tblPrEx>
         <w:tc>
           <w:tcPr>
             <w:tcW w:w="2200" w:type="dxa"/>
@@ -10771,12 +9895,6 @@
         </w:tc>
       </w:tr>
       <w:tr>
-        <w:tblPrEx>
-          <w:tblCellMar>
-            <w:top w:w="0" w:type="dxa"/>
-            <w:bottom w:w="0" w:type="dxa"/>
-          </w:tblCellMar>
-        </w:tblPrEx>
         <w:tc>
           <w:tcPr>
             <w:tcW w:w="2200" w:type="dxa"/>
@@ -10860,12 +9978,6 @@
         <w:gridCol w:w="6826"/>
       </w:tblGrid>
       <w:tr>
-        <w:tblPrEx>
-          <w:tblCellMar>
-            <w:top w:w="0" w:type="dxa"/>
-            <w:bottom w:w="0" w:type="dxa"/>
-          </w:tblCellMar>
-        </w:tblPrEx>
         <w:tc>
           <w:tcPr>
             <w:tcW w:w="2200" w:type="dxa"/>
@@ -10918,12 +10030,6 @@
         </w:tc>
       </w:tr>
       <w:tr>
-        <w:tblPrEx>
-          <w:tblCellMar>
-            <w:top w:w="0" w:type="dxa"/>
-            <w:bottom w:w="0" w:type="dxa"/>
-          </w:tblCellMar>
-        </w:tblPrEx>
         <w:tc>
           <w:tcPr>
             <w:tcW w:w="2200" w:type="dxa"/>
@@ -10976,12 +10082,6 @@
         </w:tc>
       </w:tr>
       <w:tr>
-        <w:tblPrEx>
-          <w:tblCellMar>
-            <w:top w:w="0" w:type="dxa"/>
-            <w:bottom w:w="0" w:type="dxa"/>
-          </w:tblCellMar>
-        </w:tblPrEx>
         <w:tc>
           <w:tcPr>
             <w:tcW w:w="2200" w:type="dxa"/>
@@ -11034,12 +10134,6 @@
         </w:tc>
       </w:tr>
       <w:tr>
-        <w:tblPrEx>
-          <w:tblCellMar>
-            <w:top w:w="0" w:type="dxa"/>
-            <w:bottom w:w="0" w:type="dxa"/>
-          </w:tblCellMar>
-        </w:tblPrEx>
         <w:tc>
           <w:tcPr>
             <w:tcW w:w="2200" w:type="dxa"/>
@@ -11138,12 +10232,6 @@
         <w:gridCol w:w="3013"/>
       </w:tblGrid>
       <w:tr>
-        <w:tblPrEx>
-          <w:tblCellMar>
-            <w:top w:w="0" w:type="dxa"/>
-            <w:bottom w:w="0" w:type="dxa"/>
-          </w:tblCellMar>
-        </w:tblPrEx>
         <w:trPr>
           <w:tblHeader/>
         </w:trPr>
@@ -11233,12 +10321,6 @@
         </w:tc>
       </w:tr>
       <w:tr>
-        <w:tblPrEx>
-          <w:tblCellMar>
-            <w:top w:w="0" w:type="dxa"/>
-            <w:bottom w:w="0" w:type="dxa"/>
-          </w:tblCellMar>
-        </w:tblPrEx>
         <w:tc>
           <w:tcPr>
             <w:tcW w:w="3000" w:type="dxa"/>
@@ -11310,12 +10392,6 @@
         </w:tc>
       </w:tr>
       <w:tr>
-        <w:tblPrEx>
-          <w:tblCellMar>
-            <w:top w:w="0" w:type="dxa"/>
-            <w:bottom w:w="0" w:type="dxa"/>
-          </w:tblCellMar>
-        </w:tblPrEx>
         <w:tc>
           <w:tcPr>
             <w:tcW w:w="3000" w:type="dxa"/>
@@ -11387,12 +10463,6 @@
         </w:tc>
       </w:tr>
       <w:tr>
-        <w:tblPrEx>
-          <w:tblCellMar>
-            <w:top w:w="0" w:type="dxa"/>
-            <w:bottom w:w="0" w:type="dxa"/>
-          </w:tblCellMar>
-        </w:tblPrEx>
         <w:tc>
           <w:tcPr>
             <w:tcW w:w="3000" w:type="dxa"/>
@@ -11464,12 +10534,6 @@
         </w:tc>
       </w:tr>
       <w:tr>
-        <w:tblPrEx>
-          <w:tblCellMar>
-            <w:top w:w="0" w:type="dxa"/>
-            <w:bottom w:w="0" w:type="dxa"/>
-          </w:tblCellMar>
-        </w:tblPrEx>
         <w:tc>
           <w:tcPr>
             <w:tcW w:w="3000" w:type="dxa"/>
@@ -11541,12 +10605,6 @@
         </w:tc>
       </w:tr>
       <w:tr>
-        <w:tblPrEx>
-          <w:tblCellMar>
-            <w:top w:w="0" w:type="dxa"/>
-            <w:bottom w:w="0" w:type="dxa"/>
-          </w:tblCellMar>
-        </w:tblPrEx>
         <w:tc>
           <w:tcPr>
             <w:tcW w:w="3000" w:type="dxa"/>
@@ -11811,12 +10869,6 @@
         <w:gridCol w:w="6026"/>
       </w:tblGrid>
       <w:tr>
-        <w:tblPrEx>
-          <w:tblCellMar>
-            <w:top w:w="0" w:type="dxa"/>
-            <w:bottom w:w="0" w:type="dxa"/>
-          </w:tblCellMar>
-        </w:tblPrEx>
         <w:trPr>
           <w:tblHeader/>
         </w:trPr>
@@ -11878,12 +10930,6 @@
         </w:tc>
       </w:tr>
       <w:tr>
-        <w:tblPrEx>
-          <w:tblCellMar>
-            <w:top w:w="0" w:type="dxa"/>
-            <w:bottom w:w="0" w:type="dxa"/>
-          </w:tblCellMar>
-        </w:tblPrEx>
         <w:tc>
           <w:tcPr>
             <w:tcW w:w="3000" w:type="dxa"/>
@@ -11932,12 +10978,6 @@
         </w:tc>
       </w:tr>
       <w:tr>
-        <w:tblPrEx>
-          <w:tblCellMar>
-            <w:top w:w="0" w:type="dxa"/>
-            <w:bottom w:w="0" w:type="dxa"/>
-          </w:tblCellMar>
-        </w:tblPrEx>
         <w:tc>
           <w:tcPr>
             <w:tcW w:w="3000" w:type="dxa"/>
@@ -11986,12 +11026,6 @@
         </w:tc>
       </w:tr>
       <w:tr>
-        <w:tblPrEx>
-          <w:tblCellMar>
-            <w:top w:w="0" w:type="dxa"/>
-            <w:bottom w:w="0" w:type="dxa"/>
-          </w:tblCellMar>
-        </w:tblPrEx>
         <w:tc>
           <w:tcPr>
             <w:tcW w:w="3000" w:type="dxa"/>
@@ -12040,12 +11074,6 @@
         </w:tc>
       </w:tr>
       <w:tr>
-        <w:tblPrEx>
-          <w:tblCellMar>
-            <w:top w:w="0" w:type="dxa"/>
-            <w:bottom w:w="0" w:type="dxa"/>
-          </w:tblCellMar>
-        </w:tblPrEx>
         <w:tc>
           <w:tcPr>
             <w:tcW w:w="3000" w:type="dxa"/>
@@ -12094,12 +11122,6 @@
         </w:tc>
       </w:tr>
       <w:tr>
-        <w:tblPrEx>
-          <w:tblCellMar>
-            <w:top w:w="0" w:type="dxa"/>
-            <w:bottom w:w="0" w:type="dxa"/>
-          </w:tblCellMar>
-        </w:tblPrEx>
         <w:tc>
           <w:tcPr>
             <w:tcW w:w="3000" w:type="dxa"/>
@@ -12148,12 +11170,6 @@
         </w:tc>
       </w:tr>
       <w:tr>
-        <w:tblPrEx>
-          <w:tblCellMar>
-            <w:top w:w="0" w:type="dxa"/>
-            <w:bottom w:w="0" w:type="dxa"/>
-          </w:tblCellMar>
-        </w:tblPrEx>
         <w:tc>
           <w:tcPr>
             <w:tcW w:w="3000" w:type="dxa"/>
@@ -12202,12 +11218,6 @@
         </w:tc>
       </w:tr>
       <w:tr>
-        <w:tblPrEx>
-          <w:tblCellMar>
-            <w:top w:w="0" w:type="dxa"/>
-            <w:bottom w:w="0" w:type="dxa"/>
-          </w:tblCellMar>
-        </w:tblPrEx>
         <w:tc>
           <w:tcPr>
             <w:tcW w:w="3000" w:type="dxa"/>
@@ -12302,12 +11312,6 @@
         <w:gridCol w:w="3826"/>
       </w:tblGrid>
       <w:tr>
-        <w:tblPrEx>
-          <w:tblCellMar>
-            <w:top w:w="0" w:type="dxa"/>
-            <w:bottom w:w="0" w:type="dxa"/>
-          </w:tblCellMar>
-        </w:tblPrEx>
         <w:trPr>
           <w:tblHeader/>
         </w:trPr>
@@ -12397,12 +11401,6 @@
         </w:tc>
       </w:tr>
       <w:tr>
-        <w:tblPrEx>
-          <w:tblCellMar>
-            <w:top w:w="0" w:type="dxa"/>
-            <w:bottom w:w="0" w:type="dxa"/>
-          </w:tblCellMar>
-        </w:tblPrEx>
         <w:tc>
           <w:tcPr>
             <w:tcW w:w="2200" w:type="dxa"/>
@@ -12474,12 +11472,6 @@
         </w:tc>
       </w:tr>
       <w:tr>
-        <w:tblPrEx>
-          <w:tblCellMar>
-            <w:top w:w="0" w:type="dxa"/>
-            <w:bottom w:w="0" w:type="dxa"/>
-          </w:tblCellMar>
-        </w:tblPrEx>
         <w:tc>
           <w:tcPr>
             <w:tcW w:w="2200" w:type="dxa"/>
@@ -12551,12 +11543,6 @@
         </w:tc>
       </w:tr>
       <w:tr>
-        <w:tblPrEx>
-          <w:tblCellMar>
-            <w:top w:w="0" w:type="dxa"/>
-            <w:bottom w:w="0" w:type="dxa"/>
-          </w:tblCellMar>
-        </w:tblPrEx>
         <w:tc>
           <w:tcPr>
             <w:tcW w:w="2200" w:type="dxa"/>
@@ -12628,12 +11614,6 @@
         </w:tc>
       </w:tr>
       <w:tr>
-        <w:tblPrEx>
-          <w:tblCellMar>
-            <w:top w:w="0" w:type="dxa"/>
-            <w:bottom w:w="0" w:type="dxa"/>
-          </w:tblCellMar>
-        </w:tblPrEx>
         <w:tc>
           <w:tcPr>
             <w:tcW w:w="2200" w:type="dxa"/>
@@ -12705,12 +11685,6 @@
         </w:tc>
       </w:tr>
       <w:tr>
-        <w:tblPrEx>
-          <w:tblCellMar>
-            <w:top w:w="0" w:type="dxa"/>
-            <w:bottom w:w="0" w:type="dxa"/>
-          </w:tblCellMar>
-        </w:tblPrEx>
         <w:tc>
           <w:tcPr>
             <w:tcW w:w="2200" w:type="dxa"/>
@@ -12782,12 +11756,6 @@
         </w:tc>
       </w:tr>
       <w:tr>
-        <w:tblPrEx>
-          <w:tblCellMar>
-            <w:top w:w="0" w:type="dxa"/>
-            <w:bottom w:w="0" w:type="dxa"/>
-          </w:tblCellMar>
-        </w:tblPrEx>
         <w:tc>
           <w:tcPr>
             <w:tcW w:w="2200" w:type="dxa"/>
@@ -12859,12 +11827,6 @@
         </w:tc>
       </w:tr>
       <w:tr>
-        <w:tblPrEx>
-          <w:tblCellMar>
-            <w:top w:w="0" w:type="dxa"/>
-            <w:bottom w:w="0" w:type="dxa"/>
-          </w:tblCellMar>
-        </w:tblPrEx>
         <w:tc>
           <w:tcPr>
             <w:tcW w:w="2200" w:type="dxa"/>
@@ -12936,12 +11898,6 @@
         </w:tc>
       </w:tr>
       <w:tr>
-        <w:tblPrEx>
-          <w:tblCellMar>
-            <w:top w:w="0" w:type="dxa"/>
-            <w:bottom w:w="0" w:type="dxa"/>
-          </w:tblCellMar>
-        </w:tblPrEx>
         <w:tc>
           <w:tcPr>
             <w:tcW w:w="2200" w:type="dxa"/>
@@ -13013,12 +11969,6 @@
         </w:tc>
       </w:tr>
       <w:tr>
-        <w:tblPrEx>
-          <w:tblCellMar>
-            <w:top w:w="0" w:type="dxa"/>
-            <w:bottom w:w="0" w:type="dxa"/>
-          </w:tblCellMar>
-        </w:tblPrEx>
         <w:tc>
           <w:tcPr>
             <w:tcW w:w="2200" w:type="dxa"/>
@@ -13090,12 +12040,6 @@
         </w:tc>
       </w:tr>
       <w:tr>
-        <w:tblPrEx>
-          <w:tblCellMar>
-            <w:top w:w="0" w:type="dxa"/>
-            <w:bottom w:w="0" w:type="dxa"/>
-          </w:tblCellMar>
-        </w:tblPrEx>
         <w:tc>
           <w:tcPr>
             <w:tcW w:w="2200" w:type="dxa"/>
@@ -13204,12 +12148,6 @@
         <w:gridCol w:w="7026"/>
       </w:tblGrid>
       <w:tr>
-        <w:tblPrEx>
-          <w:tblCellMar>
-            <w:top w:w="0" w:type="dxa"/>
-            <w:bottom w:w="0" w:type="dxa"/>
-          </w:tblCellMar>
-        </w:tblPrEx>
         <w:trPr>
           <w:tblHeader/>
         </w:trPr>
@@ -13271,12 +12209,6 @@
         </w:tc>
       </w:tr>
       <w:tr>
-        <w:tblPrEx>
-          <w:tblCellMar>
-            <w:top w:w="0" w:type="dxa"/>
-            <w:bottom w:w="0" w:type="dxa"/>
-          </w:tblCellMar>
-        </w:tblPrEx>
         <w:tc>
           <w:tcPr>
             <w:tcW w:w="2000" w:type="dxa"/>
@@ -13325,12 +12257,6 @@
         </w:tc>
       </w:tr>
       <w:tr>
-        <w:tblPrEx>
-          <w:tblCellMar>
-            <w:top w:w="0" w:type="dxa"/>
-            <w:bottom w:w="0" w:type="dxa"/>
-          </w:tblCellMar>
-        </w:tblPrEx>
         <w:tc>
           <w:tcPr>
             <w:tcW w:w="2000" w:type="dxa"/>
@@ -13379,12 +12305,6 @@
         </w:tc>
       </w:tr>
       <w:tr>
-        <w:tblPrEx>
-          <w:tblCellMar>
-            <w:top w:w="0" w:type="dxa"/>
-            <w:bottom w:w="0" w:type="dxa"/>
-          </w:tblCellMar>
-        </w:tblPrEx>
         <w:tc>
           <w:tcPr>
             <w:tcW w:w="2000" w:type="dxa"/>
@@ -13433,12 +12353,6 @@
         </w:tc>
       </w:tr>
       <w:tr>
-        <w:tblPrEx>
-          <w:tblCellMar>
-            <w:top w:w="0" w:type="dxa"/>
-            <w:bottom w:w="0" w:type="dxa"/>
-          </w:tblCellMar>
-        </w:tblPrEx>
         <w:tc>
           <w:tcPr>
             <w:tcW w:w="2000" w:type="dxa"/>
@@ -13487,12 +12401,6 @@
         </w:tc>
       </w:tr>
       <w:tr>
-        <w:tblPrEx>
-          <w:tblCellMar>
-            <w:top w:w="0" w:type="dxa"/>
-            <w:bottom w:w="0" w:type="dxa"/>
-          </w:tblCellMar>
-        </w:tblPrEx>
         <w:tc>
           <w:tcPr>
             <w:tcW w:w="2000" w:type="dxa"/>
@@ -13572,12 +12480,6 @@
         <w:gridCol w:w="5526"/>
       </w:tblGrid>
       <w:tr>
-        <w:tblPrEx>
-          <w:tblCellMar>
-            <w:top w:w="0" w:type="dxa"/>
-            <w:bottom w:w="0" w:type="dxa"/>
-          </w:tblCellMar>
-        </w:tblPrEx>
         <w:trPr>
           <w:tblHeader/>
         </w:trPr>
@@ -13639,12 +12541,6 @@
         </w:tc>
       </w:tr>
       <w:tr>
-        <w:tblPrEx>
-          <w:tblCellMar>
-            <w:top w:w="0" w:type="dxa"/>
-            <w:bottom w:w="0" w:type="dxa"/>
-          </w:tblCellMar>
-        </w:tblPrEx>
         <w:tc>
           <w:tcPr>
             <w:tcW w:w="3500" w:type="dxa"/>
@@ -13693,12 +12589,6 @@
         </w:tc>
       </w:tr>
       <w:tr>
-        <w:tblPrEx>
-          <w:tblCellMar>
-            <w:top w:w="0" w:type="dxa"/>
-            <w:bottom w:w="0" w:type="dxa"/>
-          </w:tblCellMar>
-        </w:tblPrEx>
         <w:tc>
           <w:tcPr>
             <w:tcW w:w="3500" w:type="dxa"/>
@@ -13747,12 +12637,6 @@
         </w:tc>
       </w:tr>
       <w:tr>
-        <w:tblPrEx>
-          <w:tblCellMar>
-            <w:top w:w="0" w:type="dxa"/>
-            <w:bottom w:w="0" w:type="dxa"/>
-          </w:tblCellMar>
-        </w:tblPrEx>
         <w:tc>
           <w:tcPr>
             <w:tcW w:w="3500" w:type="dxa"/>
@@ -13801,12 +12685,6 @@
         </w:tc>
       </w:tr>
       <w:tr>
-        <w:tblPrEx>
-          <w:tblCellMar>
-            <w:top w:w="0" w:type="dxa"/>
-            <w:bottom w:w="0" w:type="dxa"/>
-          </w:tblCellMar>
-        </w:tblPrEx>
         <w:tc>
           <w:tcPr>
             <w:tcW w:w="3500" w:type="dxa"/>
@@ -13855,12 +12733,6 @@
         </w:tc>
       </w:tr>
       <w:tr>
-        <w:tblPrEx>
-          <w:tblCellMar>
-            <w:top w:w="0" w:type="dxa"/>
-            <w:bottom w:w="0" w:type="dxa"/>
-          </w:tblCellMar>
-        </w:tblPrEx>
         <w:tc>
           <w:tcPr>
             <w:tcW w:w="3500" w:type="dxa"/>
@@ -13909,12 +12781,6 @@
         </w:tc>
       </w:tr>
       <w:tr>
-        <w:tblPrEx>
-          <w:tblCellMar>
-            <w:top w:w="0" w:type="dxa"/>
-            <w:bottom w:w="0" w:type="dxa"/>
-          </w:tblCellMar>
-        </w:tblPrEx>
         <w:tc>
           <w:tcPr>
             <w:tcW w:w="3500" w:type="dxa"/>
@@ -14111,12 +12977,6 @@
         <w:gridCol w:w="2026"/>
       </w:tblGrid>
       <w:tr>
-        <w:tblPrEx>
-          <w:tblCellMar>
-            <w:top w:w="0" w:type="dxa"/>
-            <w:bottom w:w="0" w:type="dxa"/>
-          </w:tblCellMar>
-        </w:tblPrEx>
         <w:trPr>
           <w:tblHeader/>
         </w:trPr>
@@ -14206,12 +13066,6 @@
         </w:tc>
       </w:tr>
       <w:tr>
-        <w:tblPrEx>
-          <w:tblCellMar>
-            <w:top w:w="0" w:type="dxa"/>
-            <w:bottom w:w="0" w:type="dxa"/>
-          </w:tblCellMar>
-        </w:tblPrEx>
         <w:tc>
           <w:tcPr>
             <w:tcW w:w="3000" w:type="dxa"/>
@@ -14283,12 +13137,6 @@
         </w:tc>
       </w:tr>
       <w:tr>
-        <w:tblPrEx>
-          <w:tblCellMar>
-            <w:top w:w="0" w:type="dxa"/>
-            <w:bottom w:w="0" w:type="dxa"/>
-          </w:tblCellMar>
-        </w:tblPrEx>
         <w:tc>
           <w:tcPr>
             <w:tcW w:w="3000" w:type="dxa"/>
@@ -14360,12 +13208,6 @@
         </w:tc>
       </w:tr>
       <w:tr>
-        <w:tblPrEx>
-          <w:tblCellMar>
-            <w:top w:w="0" w:type="dxa"/>
-            <w:bottom w:w="0" w:type="dxa"/>
-          </w:tblCellMar>
-        </w:tblPrEx>
         <w:tc>
           <w:tcPr>
             <w:tcW w:w="3000" w:type="dxa"/>
@@ -14437,12 +13279,6 @@
         </w:tc>
       </w:tr>
       <w:tr>
-        <w:tblPrEx>
-          <w:tblCellMar>
-            <w:top w:w="0" w:type="dxa"/>
-            <w:bottom w:w="0" w:type="dxa"/>
-          </w:tblCellMar>
-        </w:tblPrEx>
         <w:tc>
           <w:tcPr>
             <w:tcW w:w="3000" w:type="dxa"/>
@@ -14514,12 +13350,6 @@
         </w:tc>
       </w:tr>
       <w:tr>
-        <w:tblPrEx>
-          <w:tblCellMar>
-            <w:top w:w="0" w:type="dxa"/>
-            <w:bottom w:w="0" w:type="dxa"/>
-          </w:tblCellMar>
-        </w:tblPrEx>
         <w:tc>
           <w:tcPr>
             <w:tcW w:w="3000" w:type="dxa"/>
@@ -14591,12 +13421,6 @@
         </w:tc>
       </w:tr>
       <w:tr>
-        <w:tblPrEx>
-          <w:tblCellMar>
-            <w:top w:w="0" w:type="dxa"/>
-            <w:bottom w:w="0" w:type="dxa"/>
-          </w:tblCellMar>
-        </w:tblPrEx>
         <w:tc>
           <w:tcPr>
             <w:tcW w:w="3000" w:type="dxa"/>
@@ -14668,12 +13492,6 @@
         </w:tc>
       </w:tr>
       <w:tr>
-        <w:tblPrEx>
-          <w:tblCellMar>
-            <w:top w:w="0" w:type="dxa"/>
-            <w:bottom w:w="0" w:type="dxa"/>
-          </w:tblCellMar>
-        </w:tblPrEx>
         <w:tc>
           <w:tcPr>
             <w:tcW w:w="3000" w:type="dxa"/>
@@ -14745,12 +13563,6 @@
         </w:tc>
       </w:tr>
       <w:tr>
-        <w:tblPrEx>
-          <w:tblCellMar>
-            <w:top w:w="0" w:type="dxa"/>
-            <w:bottom w:w="0" w:type="dxa"/>
-          </w:tblCellMar>
-        </w:tblPrEx>
         <w:tc>
           <w:tcPr>
             <w:tcW w:w="3000" w:type="dxa"/>
@@ -14822,12 +13634,6 @@
         </w:tc>
       </w:tr>
       <w:tr>
-        <w:tblPrEx>
-          <w:tblCellMar>
-            <w:top w:w="0" w:type="dxa"/>
-            <w:bottom w:w="0" w:type="dxa"/>
-          </w:tblCellMar>
-        </w:tblPrEx>
         <w:tc>
           <w:tcPr>
             <w:tcW w:w="3000" w:type="dxa"/>
@@ -14953,12 +13759,6 @@
         <w:gridCol w:w="4526"/>
       </w:tblGrid>
       <w:tr>
-        <w:tblPrEx>
-          <w:tblCellMar>
-            <w:top w:w="0" w:type="dxa"/>
-            <w:bottom w:w="0" w:type="dxa"/>
-          </w:tblCellMar>
-        </w:tblPrEx>
         <w:trPr>
           <w:tblHeader/>
         </w:trPr>
@@ -15048,12 +13848,6 @@
         </w:tc>
       </w:tr>
       <w:tr>
-        <w:tblPrEx>
-          <w:tblCellMar>
-            <w:top w:w="0" w:type="dxa"/>
-            <w:bottom w:w="0" w:type="dxa"/>
-          </w:tblCellMar>
-        </w:tblPrEx>
         <w:tc>
           <w:tcPr>
             <w:tcW w:w="1800" w:type="dxa"/>
@@ -15125,12 +13919,6 @@
         </w:tc>
       </w:tr>
       <w:tr>
-        <w:tblPrEx>
-          <w:tblCellMar>
-            <w:top w:w="0" w:type="dxa"/>
-            <w:bottom w:w="0" w:type="dxa"/>
-          </w:tblCellMar>
-        </w:tblPrEx>
         <w:tc>
           <w:tcPr>
             <w:tcW w:w="1800" w:type="dxa"/>
@@ -15202,12 +13990,6 @@
         </w:tc>
       </w:tr>
       <w:tr>
-        <w:tblPrEx>
-          <w:tblCellMar>
-            <w:top w:w="0" w:type="dxa"/>
-            <w:bottom w:w="0" w:type="dxa"/>
-          </w:tblCellMar>
-        </w:tblPrEx>
         <w:tc>
           <w:tcPr>
             <w:tcW w:w="1800" w:type="dxa"/>
@@ -15279,12 +14061,6 @@
         </w:tc>
       </w:tr>
       <w:tr>
-        <w:tblPrEx>
-          <w:tblCellMar>
-            <w:top w:w="0" w:type="dxa"/>
-            <w:bottom w:w="0" w:type="dxa"/>
-          </w:tblCellMar>
-        </w:tblPrEx>
         <w:tc>
           <w:tcPr>
             <w:tcW w:w="1800" w:type="dxa"/>
@@ -15389,12 +14165,6 @@
         <w:gridCol w:w="1526"/>
       </w:tblGrid>
       <w:tr>
-        <w:tblPrEx>
-          <w:tblCellMar>
-            <w:top w:w="0" w:type="dxa"/>
-            <w:bottom w:w="0" w:type="dxa"/>
-          </w:tblCellMar>
-        </w:tblPrEx>
         <w:trPr>
           <w:tblHeader/>
         </w:trPr>
@@ -15512,12 +14282,6 @@
         </w:tc>
       </w:tr>
       <w:tr>
-        <w:tblPrEx>
-          <w:tblCellMar>
-            <w:top w:w="0" w:type="dxa"/>
-            <w:bottom w:w="0" w:type="dxa"/>
-          </w:tblCellMar>
-        </w:tblPrEx>
         <w:tc>
           <w:tcPr>
             <w:tcW w:w="2500" w:type="dxa"/>
@@ -15612,12 +14376,6 @@
         </w:tc>
       </w:tr>
       <w:tr>
-        <w:tblPrEx>
-          <w:tblCellMar>
-            <w:top w:w="0" w:type="dxa"/>
-            <w:bottom w:w="0" w:type="dxa"/>
-          </w:tblCellMar>
-        </w:tblPrEx>
         <w:tc>
           <w:tcPr>
             <w:tcW w:w="2500" w:type="dxa"/>
@@ -15712,12 +14470,6 @@
         </w:tc>
       </w:tr>
       <w:tr>
-        <w:tblPrEx>
-          <w:tblCellMar>
-            <w:top w:w="0" w:type="dxa"/>
-            <w:bottom w:w="0" w:type="dxa"/>
-          </w:tblCellMar>
-        </w:tblPrEx>
         <w:tc>
           <w:tcPr>
             <w:tcW w:w="2500" w:type="dxa"/>
@@ -15812,12 +14564,6 @@
         </w:tc>
       </w:tr>
       <w:tr>
-        <w:tblPrEx>
-          <w:tblCellMar>
-            <w:top w:w="0" w:type="dxa"/>
-            <w:bottom w:w="0" w:type="dxa"/>
-          </w:tblCellMar>
-        </w:tblPrEx>
         <w:tc>
           <w:tcPr>
             <w:tcW w:w="2500" w:type="dxa"/>
@@ -15912,12 +14658,6 @@
         </w:tc>
       </w:tr>
       <w:tr>
-        <w:tblPrEx>
-          <w:tblCellMar>
-            <w:top w:w="0" w:type="dxa"/>
-            <w:bottom w:w="0" w:type="dxa"/>
-          </w:tblCellMar>
-        </w:tblPrEx>
         <w:tc>
           <w:tcPr>
             <w:tcW w:w="2500" w:type="dxa"/>
@@ -16012,12 +14752,6 @@
         </w:tc>
       </w:tr>
       <w:tr>
-        <w:tblPrEx>
-          <w:tblCellMar>
-            <w:top w:w="0" w:type="dxa"/>
-            <w:bottom w:w="0" w:type="dxa"/>
-          </w:tblCellMar>
-        </w:tblPrEx>
         <w:tc>
           <w:tcPr>
             <w:tcW w:w="2500" w:type="dxa"/>
@@ -16112,12 +14846,6 @@
         </w:tc>
       </w:tr>
       <w:tr>
-        <w:tblPrEx>
-          <w:tblCellMar>
-            <w:top w:w="0" w:type="dxa"/>
-            <w:bottom w:w="0" w:type="dxa"/>
-          </w:tblCellMar>
-        </w:tblPrEx>
         <w:tc>
           <w:tcPr>
             <w:tcW w:w="2500" w:type="dxa"/>
@@ -16244,12 +14972,6 @@
         <w:gridCol w:w="5526"/>
       </w:tblGrid>
       <w:tr>
-        <w:tblPrEx>
-          <w:tblCellMar>
-            <w:top w:w="0" w:type="dxa"/>
-            <w:bottom w:w="0" w:type="dxa"/>
-          </w:tblCellMar>
-        </w:tblPrEx>
         <w:trPr>
           <w:tblHeader/>
         </w:trPr>
@@ -16339,12 +15061,6 @@
         </w:tc>
       </w:tr>
       <w:tr>
-        <w:tblPrEx>
-          <w:tblCellMar>
-            <w:top w:w="0" w:type="dxa"/>
-            <w:bottom w:w="0" w:type="dxa"/>
-          </w:tblCellMar>
-        </w:tblPrEx>
         <w:tc>
           <w:tcPr>
             <w:tcW w:w="2000" w:type="dxa"/>
@@ -16416,12 +15132,6 @@
         </w:tc>
       </w:tr>
       <w:tr>
-        <w:tblPrEx>
-          <w:tblCellMar>
-            <w:top w:w="0" w:type="dxa"/>
-            <w:bottom w:w="0" w:type="dxa"/>
-          </w:tblCellMar>
-        </w:tblPrEx>
         <w:tc>
           <w:tcPr>
             <w:tcW w:w="2000" w:type="dxa"/>
@@ -16493,12 +15203,6 @@
         </w:tc>
       </w:tr>
       <w:tr>
-        <w:tblPrEx>
-          <w:tblCellMar>
-            <w:top w:w="0" w:type="dxa"/>
-            <w:bottom w:w="0" w:type="dxa"/>
-          </w:tblCellMar>
-        </w:tblPrEx>
         <w:tc>
           <w:tcPr>
             <w:tcW w:w="2000" w:type="dxa"/>
@@ -16570,12 +15274,6 @@
         </w:tc>
       </w:tr>
       <w:tr>
-        <w:tblPrEx>
-          <w:tblCellMar>
-            <w:top w:w="0" w:type="dxa"/>
-            <w:bottom w:w="0" w:type="dxa"/>
-          </w:tblCellMar>
-        </w:tblPrEx>
         <w:tc>
           <w:tcPr>
             <w:tcW w:w="2000" w:type="dxa"/>
@@ -16647,12 +15345,6 @@
         </w:tc>
       </w:tr>
       <w:tr>
-        <w:tblPrEx>
-          <w:tblCellMar>
-            <w:top w:w="0" w:type="dxa"/>
-            <w:bottom w:w="0" w:type="dxa"/>
-          </w:tblCellMar>
-        </w:tblPrEx>
         <w:tc>
           <w:tcPr>
             <w:tcW w:w="2000" w:type="dxa"/>
@@ -16724,12 +15416,6 @@
         </w:tc>
       </w:tr>
       <w:tr>
-        <w:tblPrEx>
-          <w:tblCellMar>
-            <w:top w:w="0" w:type="dxa"/>
-            <w:bottom w:w="0" w:type="dxa"/>
-          </w:tblCellMar>
-        </w:tblPrEx>
         <w:tc>
           <w:tcPr>
             <w:tcW w:w="2000" w:type="dxa"/>
@@ -16840,12 +15526,6 @@
         <w:gridCol w:w="3226"/>
       </w:tblGrid>
       <w:tr>
-        <w:tblPrEx>
-          <w:tblCellMar>
-            <w:top w:w="0" w:type="dxa"/>
-            <w:bottom w:w="0" w:type="dxa"/>
-          </w:tblCellMar>
-        </w:tblPrEx>
         <w:trPr>
           <w:tblHeader/>
         </w:trPr>
@@ -16963,12 +15643,6 @@
         </w:tc>
       </w:tr>
       <w:tr>
-        <w:tblPrEx>
-          <w:tblCellMar>
-            <w:top w:w="0" w:type="dxa"/>
-            <w:bottom w:w="0" w:type="dxa"/>
-          </w:tblCellMar>
-        </w:tblPrEx>
         <w:tc>
           <w:tcPr>
             <w:tcW w:w="2800" w:type="dxa"/>
@@ -17063,12 +15737,6 @@
         </w:tc>
       </w:tr>
       <w:tr>
-        <w:tblPrEx>
-          <w:tblCellMar>
-            <w:top w:w="0" w:type="dxa"/>
-            <w:bottom w:w="0" w:type="dxa"/>
-          </w:tblCellMar>
-        </w:tblPrEx>
         <w:tc>
           <w:tcPr>
             <w:tcW w:w="2800" w:type="dxa"/>
@@ -17163,12 +15831,6 @@
         </w:tc>
       </w:tr>
       <w:tr>
-        <w:tblPrEx>
-          <w:tblCellMar>
-            <w:top w:w="0" w:type="dxa"/>
-            <w:bottom w:w="0" w:type="dxa"/>
-          </w:tblCellMar>
-        </w:tblPrEx>
         <w:tc>
           <w:tcPr>
             <w:tcW w:w="2800" w:type="dxa"/>
@@ -17263,12 +15925,6 @@
         </w:tc>
       </w:tr>
       <w:tr>
-        <w:tblPrEx>
-          <w:tblCellMar>
-            <w:top w:w="0" w:type="dxa"/>
-            <w:bottom w:w="0" w:type="dxa"/>
-          </w:tblCellMar>
-        </w:tblPrEx>
         <w:tc>
           <w:tcPr>
             <w:tcW w:w="2800" w:type="dxa"/>
@@ -17363,12 +16019,6 @@
         </w:tc>
       </w:tr>
       <w:tr>
-        <w:tblPrEx>
-          <w:tblCellMar>
-            <w:top w:w="0" w:type="dxa"/>
-            <w:bottom w:w="0" w:type="dxa"/>
-          </w:tblCellMar>
-        </w:tblPrEx>
         <w:tc>
           <w:tcPr>
             <w:tcW w:w="2800" w:type="dxa"/>
@@ -17463,12 +16113,6 @@
         </w:tc>
       </w:tr>
       <w:tr>
-        <w:tblPrEx>
-          <w:tblCellMar>
-            <w:top w:w="0" w:type="dxa"/>
-            <w:bottom w:w="0" w:type="dxa"/>
-          </w:tblCellMar>
-        </w:tblPrEx>
         <w:tc>
           <w:tcPr>
             <w:tcW w:w="2800" w:type="dxa"/>
@@ -17814,12 +16458,6 @@
         <w:gridCol w:w="6026"/>
       </w:tblGrid>
       <w:tr>
-        <w:tblPrEx>
-          <w:tblCellMar>
-            <w:top w:w="0" w:type="dxa"/>
-            <w:bottom w:w="0" w:type="dxa"/>
-          </w:tblCellMar>
-        </w:tblPrEx>
         <w:trPr>
           <w:tblHeader/>
         </w:trPr>
@@ -17881,12 +16519,6 @@
         </w:tc>
       </w:tr>
       <w:tr>
-        <w:tblPrEx>
-          <w:tblCellMar>
-            <w:top w:w="0" w:type="dxa"/>
-            <w:bottom w:w="0" w:type="dxa"/>
-          </w:tblCellMar>
-        </w:tblPrEx>
         <w:tc>
           <w:tcPr>
             <w:tcW w:w="3000" w:type="dxa"/>
@@ -17935,12 +16567,6 @@
         </w:tc>
       </w:tr>
       <w:tr>
-        <w:tblPrEx>
-          <w:tblCellMar>
-            <w:top w:w="0" w:type="dxa"/>
-            <w:bottom w:w="0" w:type="dxa"/>
-          </w:tblCellMar>
-        </w:tblPrEx>
         <w:tc>
           <w:tcPr>
             <w:tcW w:w="3000" w:type="dxa"/>
@@ -17989,12 +16615,6 @@
         </w:tc>
       </w:tr>
       <w:tr>
-        <w:tblPrEx>
-          <w:tblCellMar>
-            <w:top w:w="0" w:type="dxa"/>
-            <w:bottom w:w="0" w:type="dxa"/>
-          </w:tblCellMar>
-        </w:tblPrEx>
         <w:tc>
           <w:tcPr>
             <w:tcW w:w="3000" w:type="dxa"/>
@@ -18043,12 +16663,6 @@
         </w:tc>
       </w:tr>
       <w:tr>
-        <w:tblPrEx>
-          <w:tblCellMar>
-            <w:top w:w="0" w:type="dxa"/>
-            <w:bottom w:w="0" w:type="dxa"/>
-          </w:tblCellMar>
-        </w:tblPrEx>
         <w:tc>
           <w:tcPr>
             <w:tcW w:w="3000" w:type="dxa"/>
@@ -18097,12 +16711,6 @@
         </w:tc>
       </w:tr>
       <w:tr>
-        <w:tblPrEx>
-          <w:tblCellMar>
-            <w:top w:w="0" w:type="dxa"/>
-            <w:bottom w:w="0" w:type="dxa"/>
-          </w:tblCellMar>
-        </w:tblPrEx>
         <w:tc>
           <w:tcPr>
             <w:tcW w:w="3000" w:type="dxa"/>
@@ -18151,12 +16759,6 @@
         </w:tc>
       </w:tr>
       <w:tr>
-        <w:tblPrEx>
-          <w:tblCellMar>
-            <w:top w:w="0" w:type="dxa"/>
-            <w:bottom w:w="0" w:type="dxa"/>
-          </w:tblCellMar>
-        </w:tblPrEx>
         <w:tc>
           <w:tcPr>
             <w:tcW w:w="3000" w:type="dxa"/>
@@ -18205,12 +16807,6 @@
         </w:tc>
       </w:tr>
       <w:tr>
-        <w:tblPrEx>
-          <w:tblCellMar>
-            <w:top w:w="0" w:type="dxa"/>
-            <w:bottom w:w="0" w:type="dxa"/>
-          </w:tblCellMar>
-        </w:tblPrEx>
         <w:tc>
           <w:tcPr>
             <w:tcW w:w="3000" w:type="dxa"/>
@@ -18259,12 +16855,6 @@
         </w:tc>
       </w:tr>
       <w:tr>
-        <w:tblPrEx>
-          <w:tblCellMar>
-            <w:top w:w="0" w:type="dxa"/>
-            <w:bottom w:w="0" w:type="dxa"/>
-          </w:tblCellMar>
-        </w:tblPrEx>
         <w:tc>
           <w:tcPr>
             <w:tcW w:w="3000" w:type="dxa"/>
@@ -18313,12 +16903,6 @@
         </w:tc>
       </w:tr>
       <w:tr>
-        <w:tblPrEx>
-          <w:tblCellMar>
-            <w:top w:w="0" w:type="dxa"/>
-            <w:bottom w:w="0" w:type="dxa"/>
-          </w:tblCellMar>
-        </w:tblPrEx>
         <w:tc>
           <w:tcPr>
             <w:tcW w:w="3000" w:type="dxa"/>
@@ -18367,12 +16951,6 @@
         </w:tc>
       </w:tr>
       <w:tr>
-        <w:tblPrEx>
-          <w:tblCellMar>
-            <w:top w:w="0" w:type="dxa"/>
-            <w:bottom w:w="0" w:type="dxa"/>
-          </w:tblCellMar>
-        </w:tblPrEx>
         <w:tc>
           <w:tcPr>
             <w:tcW w:w="3000" w:type="dxa"/>
@@ -18421,12 +16999,6 @@
         </w:tc>
       </w:tr>
       <w:tr>
-        <w:tblPrEx>
-          <w:tblCellMar>
-            <w:top w:w="0" w:type="dxa"/>
-            <w:bottom w:w="0" w:type="dxa"/>
-          </w:tblCellMar>
-        </w:tblPrEx>
         <w:tc>
           <w:tcPr>
             <w:tcW w:w="3000" w:type="dxa"/>
@@ -18576,12 +17148,6 @@
         <w:gridCol w:w="4026"/>
       </w:tblGrid>
       <w:tr>
-        <w:tblPrEx>
-          <w:tblCellMar>
-            <w:top w:w="0" w:type="dxa"/>
-            <w:bottom w:w="0" w:type="dxa"/>
-          </w:tblCellMar>
-        </w:tblPrEx>
         <w:trPr>
           <w:tblHeader/>
         </w:trPr>
@@ -18671,12 +17237,6 @@
         </w:tc>
       </w:tr>
       <w:tr>
-        <w:tblPrEx>
-          <w:tblCellMar>
-            <w:top w:w="0" w:type="dxa"/>
-            <w:bottom w:w="0" w:type="dxa"/>
-          </w:tblCellMar>
-        </w:tblPrEx>
         <w:tc>
           <w:tcPr>
             <w:tcW w:w="2500" w:type="dxa"/>
@@ -18748,12 +17308,6 @@
         </w:tc>
       </w:tr>
       <w:tr>
-        <w:tblPrEx>
-          <w:tblCellMar>
-            <w:top w:w="0" w:type="dxa"/>
-            <w:bottom w:w="0" w:type="dxa"/>
-          </w:tblCellMar>
-        </w:tblPrEx>
         <w:tc>
           <w:tcPr>
             <w:tcW w:w="2500" w:type="dxa"/>
@@ -18825,12 +17379,6 @@
         </w:tc>
       </w:tr>
       <w:tr>
-        <w:tblPrEx>
-          <w:tblCellMar>
-            <w:top w:w="0" w:type="dxa"/>
-            <w:bottom w:w="0" w:type="dxa"/>
-          </w:tblCellMar>
-        </w:tblPrEx>
         <w:tc>
           <w:tcPr>
             <w:tcW w:w="2500" w:type="dxa"/>
@@ -18902,12 +17450,6 @@
         </w:tc>
       </w:tr>
       <w:tr>
-        <w:tblPrEx>
-          <w:tblCellMar>
-            <w:top w:w="0" w:type="dxa"/>
-            <w:bottom w:w="0" w:type="dxa"/>
-          </w:tblCellMar>
-        </w:tblPrEx>
         <w:tc>
           <w:tcPr>
             <w:tcW w:w="2500" w:type="dxa"/>
@@ -18979,12 +17521,6 @@
         </w:tc>
       </w:tr>
       <w:tr>
-        <w:tblPrEx>
-          <w:tblCellMar>
-            <w:top w:w="0" w:type="dxa"/>
-            <w:bottom w:w="0" w:type="dxa"/>
-          </w:tblCellMar>
-        </w:tblPrEx>
         <w:tc>
           <w:tcPr>
             <w:tcW w:w="2500" w:type="dxa"/>
@@ -19056,12 +17592,6 @@
         </w:tc>
       </w:tr>
       <w:tr>
-        <w:tblPrEx>
-          <w:tblCellMar>
-            <w:top w:w="0" w:type="dxa"/>
-            <w:bottom w:w="0" w:type="dxa"/>
-          </w:tblCellMar>
-        </w:tblPrEx>
         <w:tc>
           <w:tcPr>
             <w:tcW w:w="2500" w:type="dxa"/>
@@ -19166,12 +17696,6 @@
         <w:gridCol w:w="3026"/>
       </w:tblGrid>
       <w:tr>
-        <w:tblPrEx>
-          <w:tblCellMar>
-            <w:top w:w="0" w:type="dxa"/>
-            <w:bottom w:w="0" w:type="dxa"/>
-          </w:tblCellMar>
-        </w:tblPrEx>
         <w:trPr>
           <w:tblHeader/>
         </w:trPr>
@@ -19290,12 +17814,6 @@
         </w:tc>
       </w:tr>
       <w:tr>
-        <w:tblPrEx>
-          <w:tblCellMar>
-            <w:top w:w="0" w:type="dxa"/>
-            <w:bottom w:w="0" w:type="dxa"/>
-          </w:tblCellMar>
-        </w:tblPrEx>
         <w:tc>
           <w:tcPr>
             <w:tcW w:w="1500" w:type="dxa"/>

</xml_diff>